<commit_message>
모델카드,README.docx 파일 생성 , 21,22,16,2 문서 수정
</commit_message>
<xml_diff>
--- a/document/20_결과보고서_v1.5.docx
+++ b/document/20_결과보고서_v1.5.docx
@@ -407,93 +407,7 @@
           </w:p>
         </w:tc>
       </w:tr>
-      <w:tr>
-        <w:trPr>
-          <w:tblHeader/>
-          <w:cantSplit/>
-        </w:trPr>
-        <w:tc>
-          <w:tcPr>
-            <w:tcW w:type="dxa" w:w="1927"/>
-            <w:tcMar>
-              <w:left w:w="90" w:type="dxa"/>
-              <w:right w:w="90" w:type="dxa"/>
-              <w:top w:w="50" w:type="dxa"/>
-              <w:bottom w:w="50" w:type="dxa"/>
-            </w:tcMar>
-            <w:vAlign w:val="center"/>
-            <w:tcBorders>
-              <w:bottom w:val="single" w:color="C3C2B7" w:sz="4"/>
-              <w:left w:val="single" w:color="C3C2B7" w:sz="4"/>
-              <w:right w:val="single" w:color="C3C2B7" w:sz="4"/>
-              <w:top w:val="single" w:color="C3C2B7" w:sz="4"/>
-            </w:tcBorders>
-            <w:shd w:val="clear" w:color="000000" w:fill="F2F1EE"/>
-          </w:tcPr>
-          <w:p>
-            <w:pPr>
-              <w:jc w:val="left"/>
-              <w:spacing w:lineRule="auto" w:line="259" w:after="0"/>
-              <w:rPr>
-                <w:shd w:val="clear" w:color="auto" w:fill="auto"/>
-              </w:rPr>
-            </w:pPr>
-            <w:r>
-              <w:rPr>
-                <w:b w:val="1"/>
-                <w:sz w:val="18"/>
-                <w:szCs w:val="18"/>
-                <w:shd w:val="clear" w:color="auto" w:fill="auto"/>
-              </w:rPr>
-              <w:t xml:space="preserve">작성 양식</w:t>
-            </w:r>
-          </w:p>
-        </w:tc>
-        <w:tc>
-          <w:tcPr>
-            <w:tcW w:type="dxa" w:w="7711"/>
-            <w:tcMar>
-              <w:left w:w="90" w:type="dxa"/>
-              <w:right w:w="90" w:type="dxa"/>
-              <w:top w:w="50" w:type="dxa"/>
-              <w:bottom w:w="50" w:type="dxa"/>
-            </w:tcMar>
-            <w:vAlign w:val="center"/>
-            <w:tcBorders>
-              <w:bottom w:val="single" w:color="C3C2B7" w:sz="4"/>
-              <w:left w:val="single" w:color="C3C2B7" w:sz="4"/>
-              <w:right w:val="single" w:color="C3C2B7" w:sz="4"/>
-              <w:top w:val="single" w:color="C3C2B7" w:sz="4"/>
-            </w:tcBorders>
-          </w:tcPr>
-          <w:p>
-            <w:pPr>
-              <w:jc w:val="left"/>
-              <w:spacing w:lineRule="auto" w:line="259" w:after="0"/>
-              <w:rPr>
-                <w:shd w:val="clear" w:color="auto" w:fill="auto"/>
-              </w:rPr>
-            </w:pPr>
-            <w:r>
-              <w:rPr>
-                <w:sz w:val="18"/>
-                <w:szCs w:val="18"/>
-                <w:shd w:val="clear" w:color="auto" w:fill="auto"/>
-              </w:rPr>
-              <w:t xml:space="preserve">협회 실무가이드 PART 5: F25 요약본 + 결과보고서 본문 8항목</w:t>
-            </w:r>
-          </w:p>
-        </w:tc>
-      </w:tr>
     </w:tbl>
-    <w:p>
-      <w:pPr>
-        <w:spacing w:after="120"/>
-        <w:rPr>
-          <w:shd w:val="clear" w:color="auto" w:fill="auto"/>
-        </w:rPr>
-      </w:pPr>
-    </w:p>
     <w:p>
       <w:pPr>
         <w:pStyle w:val="PO161"/>
@@ -1131,6 +1045,7 @@
       </w:tr>
       <w:tr>
         <w:trPr>
+          <w:trHeight w:hRule="atleast" w:val="648"/>
           <w:tblHeader/>
           <w:cantSplit/>
         </w:trPr>
@@ -1907,6 +1822,7 @@
       </w:tr>
       <w:tr>
         <w:trPr>
+          <w:trHeight w:hRule="atleast" w:val="567"/>
           <w:tblHeader/>
           <w:cantSplit/>
         </w:trPr>
@@ -2145,7 +2061,7 @@
               <a:graphicData uri="http://schemas.openxmlformats.org/drawingml/2006/picture">
                 <pic:pic xmlns:pic="http://schemas.openxmlformats.org/drawingml/2006/picture">
                   <pic:nvPicPr>
-                    <pic:cNvPr id="1" name="Picture 1" descr="C:/Users/kliyy/AppData/Roaming/PolarisOffice/ETemp/15004_11318008/35025230ea1058ea3db0c854f7d93b31f7589738.png"/>
+                    <pic:cNvPr id="1" name="Picture 1" descr="C:/Users/kliyy/AppData/Roaming/PolarisOffice/ETemp/11704_15743640/35025230ea1058ea3db0c854f7d93b31f7589738.png"/>
                     <pic:cNvPicPr>
                       <a:picLocks noChangeAspect="1" noChangeArrowheads="1"/>
                     </pic:cNvPicPr>
@@ -12773,7 +12689,7 @@
               <a:graphicData uri="http://schemas.openxmlformats.org/drawingml/2006/picture">
                 <pic:pic xmlns:pic="http://schemas.openxmlformats.org/drawingml/2006/picture">
                   <pic:nvPicPr>
-                    <pic:cNvPr id="2" name="Picture 2" descr="C:/Users/kliyy/AppData/Roaming/PolarisOffice/ETemp/15004_11318008/74af319c3fe7f2c722910570de37aea53cfb328e.png"/>
+                    <pic:cNvPr id="2" name="Picture 2" descr="C:/Users/kliyy/AppData/Roaming/PolarisOffice/ETemp/11704_15743640/74af319c3fe7f2c722910570de37aea53cfb328e.png"/>
                     <pic:cNvPicPr>
                       <a:picLocks noChangeAspect="1" noChangeArrowheads="1"/>
                     </pic:cNvPicPr>
@@ -13909,7 +13825,7 @@
               <a:graphicData uri="http://schemas.openxmlformats.org/drawingml/2006/picture">
                 <pic:pic xmlns:pic="http://schemas.openxmlformats.org/drawingml/2006/picture">
                   <pic:nvPicPr>
-                    <pic:cNvPr id="3" name="Picture 3" descr="C:/Users/kliyy/AppData/Roaming/PolarisOffice/ETemp/15004_11318008/001442b2fe79d0edc64a6e60a75bfa659bf5b038.png"/>
+                    <pic:cNvPr id="3" name="Picture 3" descr="C:/Users/kliyy/AppData/Roaming/PolarisOffice/ETemp/11704_15743640/001442b2fe79d0edc64a6e60a75bfa659bf5b038.png"/>
                     <pic:cNvPicPr>
                       <a:picLocks noChangeAspect="1" noChangeArrowheads="1"/>
                     </pic:cNvPicPr>
@@ -15600,7 +15516,7 @@
               <a:graphicData uri="http://schemas.openxmlformats.org/drawingml/2006/picture">
                 <pic:pic xmlns:pic="http://schemas.openxmlformats.org/drawingml/2006/picture">
                   <pic:nvPicPr>
-                    <pic:cNvPr id="4" name="Picture 4" descr="C:/Users/kliyy/AppData/Roaming/PolarisOffice/ETemp/15004_11318008/56583568f9d1bd370e006e88f7ae618ad5e81781.png"/>
+                    <pic:cNvPr id="4" name="Picture 4" descr="C:/Users/kliyy/AppData/Roaming/PolarisOffice/ETemp/11704_15743640/56583568f9d1bd370e006e88f7ae618ad5e81781.png"/>
                     <pic:cNvPicPr>
                       <a:picLocks noChangeAspect="1" noChangeArrowheads="1"/>
                     </pic:cNvPicPr>
@@ -26380,7 +26296,7 @@
               <w:rPr>
                 <w:sz w:val="18"/>
                 <w:szCs w:val="18"/>
-                <w:shd w:val="clear"/>
+                <w:shd w:val="clear" w:color="auto" w:fill="auto"/>
               </w:rPr>
               <w:t xml:space="preserve">팀장 요청 반영(김지훈). 분류기 비교 연구(이동혁, 09-23, </w:t>
             </w:r>
@@ -26388,7 +26304,7 @@
               <w:rPr>
                 <w:sz w:val="18"/>
                 <w:szCs w:val="18"/>
-                <w:shd w:val="clear"/>
+                <w:shd w:val="clear" w:color="auto" w:fill="auto"/>
                 <w:rFonts w:ascii="Consolas" w:eastAsia="Malgun Gothic" w:hAnsi="Consolas" w:cs="Consolas"/>
               </w:rPr>
               <w:t>vision_research</w:t>
@@ -26397,7 +26313,7 @@
               <w:rPr>
                 <w:sz w:val="18"/>
                 <w:szCs w:val="18"/>
-                <w:shd w:val="clear"/>
+                <w:shd w:val="clear" w:color="auto" w:fill="auto"/>
               </w:rPr>
               <w:t xml:space="preserve"> 브랜치 </w:t>
             </w:r>
@@ -26405,7 +26321,7 @@
               <w:rPr>
                 <w:sz w:val="18"/>
                 <w:szCs w:val="18"/>
-                <w:shd w:val="clear"/>
+                <w:shd w:val="clear" w:color="auto" w:fill="auto"/>
                 <w:rFonts w:ascii="Consolas" w:eastAsia="Malgun Gothic" w:hAnsi="Consolas" w:cs="Consolas"/>
               </w:rPr>
               <w:t>b0bd7c0</w:t>
@@ -26414,7 +26330,7 @@
               <w:rPr>
                 <w:sz w:val="18"/>
                 <w:szCs w:val="18"/>
-                <w:shd w:val="clear"/>
+                <w:shd w:val="clear" w:color="auto" w:fill="auto"/>
               </w:rPr>
               <w:t xml:space="preserve">의 </w:t>
             </w:r>
@@ -26422,7 +26338,7 @@
               <w:rPr>
                 <w:sz w:val="18"/>
                 <w:szCs w:val="18"/>
-                <w:shd w:val="clear"/>
+                <w:shd w:val="clear" w:color="auto" w:fill="auto"/>
                 <w:rFonts w:ascii="Consolas" w:eastAsia="Malgun Gothic" w:hAnsi="Consolas" w:cs="Consolas"/>
               </w:rPr>
               <w:t>RESEARCH.md</w:t>
@@ -26431,7 +26347,7 @@
               <w:rPr>
                 <w:sz w:val="18"/>
                 <w:szCs w:val="18"/>
-                <w:shd w:val="clear"/>
+                <w:shd w:val="clear" w:color="auto" w:fill="auto"/>
               </w:rPr>
               <w:t xml:space="preserve"> §7-1) 인용. F25 과제와 접근방법에 비교 결과와 출처, §5</w:t>
             </w:r>
@@ -26439,7 +26355,7 @@
               <w:rPr>
                 <w:sz w:val="18"/>
                 <w:szCs w:val="18"/>
-                <w:shd w:val="clear"/>
+                <w:shd w:val="clear" w:color="auto" w:fill="auto"/>
               </w:rPr>
               <w:t xml:space="preserve">-5 분류기 비교(연구) 신설(근거 자료 위치는 §5-6으로), §5-6에 연구 문서 행, §8-1 </w:t>
             </w:r>
@@ -26447,7 +26363,7 @@
               <w:rPr>
                 <w:sz w:val="18"/>
                 <w:szCs w:val="18"/>
-                <w:shd w:val="clear"/>
+                <w:shd w:val="clear" w:color="auto" w:fill="auto"/>
               </w:rPr>
               <w:t xml:space="preserve">한계 3행(비교 범위·분할 방식·게이트의 정상 자세 거부). 딥러닝은 연구로만 </w:t>
             </w:r>
@@ -26455,7 +26371,7 @@
               <w:rPr>
                 <w:sz w:val="18"/>
                 <w:szCs w:val="18"/>
-                <w:shd w:val="clear"/>
+                <w:shd w:val="clear" w:color="auto" w:fill="auto"/>
               </w:rPr>
               <w:t xml:space="preserve">진행했고 운영은 SVM 유지. F25 근거 자료의 자동 테스트 수를 320건으로 </w:t>
             </w:r>
@@ -26463,7 +26379,7 @@
               <w:rPr>
                 <w:sz w:val="18"/>
                 <w:szCs w:val="18"/>
-                <w:shd w:val="clear"/>
+                <w:shd w:val="clear" w:color="auto" w:fill="auto"/>
               </w:rPr>
               <w:t xml:space="preserve">되돌림(10-04 갱신 때 253건으로 돌아갔던 것), docx의 화면 캡처 수를 md와 </w:t>
             </w:r>
@@ -26471,7 +26387,7 @@
               <w:rPr>
                 <w:sz w:val="18"/>
                 <w:szCs w:val="18"/>
-                <w:shd w:val="clear"/>
+                <w:shd w:val="clear" w:color="auto" w:fill="auto"/>
               </w:rPr>
               <w:t xml:space="preserve">같은 19장으로 맞춤, 파일명 v1.5. 같은 날 이동혁 해석 확인 반영: 결론 근거는 </w:t>
             </w:r>
@@ -26479,7 +26395,7 @@
               <w:rPr>
                 <w:sz w:val="18"/>
                 <w:szCs w:val="18"/>
-                <w:shd w:val="clear"/>
+                <w:shd w:val="clear" w:color="auto" w:fill="auto"/>
               </w:rPr>
               <w:t xml:space="preserve">AUC를 먼저(운영 기준선 p10은 자체 촬영으로 고른 값), 시험셋 직접 비교는 </w:t>
             </w:r>
@@ -26487,7 +26403,7 @@
               <w:rPr>
                 <w:sz w:val="18"/>
                 <w:szCs w:val="18"/>
-                <w:shd w:val="clear"/>
+                <w:shd w:val="clear" w:color="auto" w:fill="auto"/>
               </w:rPr>
               <w:t xml:space="preserve">HandFormer-base EDL 하나(MLP 등은 검증 단계만). 별첨 1~4 개인 역할 </w:t>
             </w:r>
@@ -26495,7 +26411,7 @@
               <w:rPr>
                 <w:sz w:val="18"/>
                 <w:szCs w:val="18"/>
-                <w:shd w:val="clear"/>
+                <w:shd w:val="clear" w:color="auto" w:fill="auto"/>
               </w:rPr>
               <w:t xml:space="preserve">기술서(4명, 한 쪽씩, 23 개인역할기술서 요약) 추가. 판정·지연 수치는 그대로</w:t>
             </w:r>
@@ -26516,35 +26432,21 @@
         <w:spacing w:before="0" w:after="160"/>
         <w:pageBreakBefore w:val="1"/>
         <w:rPr>
-          <w:shd w:val="clear"/>
+          <w:shd w:val="clear" w:color="auto" w:fill="auto"/>
         </w:rPr>
       </w:pPr>
       <w:r>
         <w:rPr>
-          <w:shd w:val="clear"/>
+          <w:shd w:val="clear" w:color="auto" w:fill="auto"/>
         </w:rPr>
         <w:t xml:space="preserve">별첨 1. 개인 역할 기술서</w:t>
       </w:r>
       <w:r>
         <w:rPr>
-          <w:shd w:val="clear"/>
+          <w:shd w:val="clear" w:color="auto" w:fill="auto"/>
           <w:lang w:eastAsia="ko-KR"/>
         </w:rPr>
-        <w:t xml:space="preserve"> </w:t>
-      </w:r>
-      <w:r>
-        <w:rPr>
-          <w:shd w:val="clear"/>
-          <w:lang w:eastAsia="ko-KR"/>
-        </w:rPr>
-        <w:t xml:space="preserve">- 송승</w:t>
-      </w:r>
-      <w:r>
-        <w:rPr>
-          <w:shd w:val="clear"/>
-          <w:lang w:eastAsia="ko-KR"/>
-        </w:rPr>
-        <w:t>호</w:t>
+        <w:t xml:space="preserve"> - 송승호</w:t>
       </w:r>
     </w:p>
     <w:tbl>
@@ -26610,7 +26512,7 @@
                 <w:b w:val="1"/>
                 <w:sz w:val="18"/>
                 <w:szCs w:val="18"/>
-                <w:shd w:val="clear"/>
+                <w:shd w:val="clear" w:color="auto" w:fill="auto"/>
               </w:rPr>
               <w:t>이름</w:t>
             </w:r>
@@ -26645,7 +26547,7 @@
               <w:rPr>
                 <w:sz w:val="18"/>
                 <w:szCs w:val="18"/>
-                <w:shd w:val="clear"/>
+                <w:shd w:val="clear" w:color="auto" w:fill="auto"/>
               </w:rPr>
               <w:t>송승호</w:t>
             </w:r>
@@ -26682,7 +26584,7 @@
                 <w:b w:val="1"/>
                 <w:sz w:val="18"/>
                 <w:szCs w:val="18"/>
-                <w:shd w:val="clear"/>
+                <w:shd w:val="clear" w:color="auto" w:fill="auto"/>
               </w:rPr>
               <w:t>팀</w:t>
             </w:r>
@@ -26717,7 +26619,7 @@
               <w:rPr>
                 <w:sz w:val="18"/>
                 <w:szCs w:val="18"/>
-                <w:shd w:val="clear"/>
+                <w:shd w:val="clear" w:color="auto" w:fill="auto"/>
               </w:rPr>
               <w:t>심기일전</w:t>
             </w:r>
@@ -26760,7 +26662,7 @@
                 <w:b w:val="1"/>
                 <w:sz w:val="18"/>
                 <w:szCs w:val="18"/>
-                <w:shd w:val="clear"/>
+                <w:shd w:val="clear" w:color="auto" w:fill="auto"/>
               </w:rPr>
               <w:t xml:space="preserve">담당 역할</w:t>
             </w:r>
@@ -26795,7 +26697,7 @@
               <w:rPr>
                 <w:sz w:val="18"/>
                 <w:szCs w:val="18"/>
-                <w:shd w:val="clear"/>
+                <w:shd w:val="clear" w:color="auto" w:fill="auto"/>
               </w:rPr>
               <w:t xml:space="preserve">팀장 · 하드웨어·로봇 동작 R · 요구사항·범위 R · 보고 R</w:t>
             </w:r>
@@ -26832,7 +26734,7 @@
                 <w:b w:val="1"/>
                 <w:sz w:val="18"/>
                 <w:szCs w:val="18"/>
-                <w:shd w:val="clear"/>
+                <w:shd w:val="clear" w:color="auto" w:fill="auto"/>
               </w:rPr>
               <w:t>프로젝트</w:t>
             </w:r>
@@ -26867,7 +26769,7 @@
               <w:rPr>
                 <w:sz w:val="18"/>
                 <w:szCs w:val="18"/>
-                <w:shd w:val="clear"/>
+                <w:shd w:val="clear" w:color="auto" w:fill="auto"/>
               </w:rPr>
               <w:t xml:space="preserve">SafeSign PhysicalAI</w:t>
             </w:r>
@@ -26910,7 +26812,7 @@
                 <w:b w:val="1"/>
                 <w:sz w:val="18"/>
                 <w:szCs w:val="18"/>
-                <w:shd w:val="clear"/>
+                <w:shd w:val="clear" w:color="auto" w:fill="auto"/>
               </w:rPr>
               <w:t>수행기간</w:t>
             </w:r>
@@ -26945,7 +26847,7 @@
               <w:rPr>
                 <w:sz w:val="18"/>
                 <w:szCs w:val="18"/>
-                <w:shd w:val="clear"/>
+                <w:shd w:val="clear" w:color="auto" w:fill="auto"/>
               </w:rPr>
               <w:t xml:space="preserve">2026-09-04 ~ 10-12 (W1~W5)</w:t>
             </w:r>
@@ -26982,7 +26884,7 @@
                 <w:b w:val="1"/>
                 <w:sz w:val="18"/>
                 <w:szCs w:val="18"/>
-                <w:shd w:val="clear"/>
+                <w:shd w:val="clear" w:color="auto" w:fill="auto"/>
               </w:rPr>
               <w:t>작성일</w:t>
             </w:r>
@@ -27017,7 +26919,7 @@
               <w:rPr>
                 <w:sz w:val="18"/>
                 <w:szCs w:val="18"/>
-                <w:shd w:val="clear"/>
+                <w:shd w:val="clear" w:color="auto" w:fill="auto"/>
               </w:rPr>
               <w:t>2026-10-06</w:t>
             </w:r>
@@ -27029,7 +26931,7 @@
       <w:pPr>
         <w:spacing w:lineRule="exact" w:line="120" w:after="0"/>
         <w:rPr>
-          <w:shd w:val="clear"/>
+          <w:shd w:val="clear" w:color="auto" w:fill="auto"/>
         </w:rPr>
       </w:pPr>
     </w:p>
@@ -27038,12 +26940,12 @@
         <w:pStyle w:val="PO163"/>
         <w:spacing w:before="90" w:after="20"/>
         <w:rPr>
-          <w:shd w:val="clear"/>
+          <w:shd w:val="clear" w:color="auto" w:fill="auto"/>
         </w:rPr>
       </w:pPr>
       <w:r>
         <w:rPr>
-          <w:shd w:val="clear"/>
+          <w:shd w:val="clear" w:color="auto" w:fill="auto"/>
         </w:rPr>
         <w:t xml:space="preserve">책임 요약</w:t>
       </w:r>
@@ -27052,7 +26954,7 @@
       <w:pPr>
         <w:spacing w:lineRule="auto" w:line="240" w:after="30"/>
         <w:rPr>
-          <w:shd w:val="clear"/>
+          <w:shd w:val="clear" w:color="auto" w:fill="auto"/>
         </w:rPr>
       </w:pPr>
       <w:r>
@@ -27060,7 +26962,7 @@
           <w:b w:val="1"/>
           <w:sz w:val="18"/>
           <w:szCs w:val="18"/>
-          <w:shd w:val="clear"/>
+          <w:shd w:val="clear" w:color="auto" w:fill="auto"/>
         </w:rPr>
         <w:t xml:space="preserve">판정 결과를 실물 장치로 옮기는 하드웨어 경로 전체를 맡고, 지연 KPI 2개를 실물에서 측정했다.</w:t>
       </w:r>
@@ -27074,14 +26976,14 @@
         </w:numPr>
         <w:spacing w:lineRule="auto" w:line="240" w:after="0"/>
         <w:rPr>
-          <w:shd w:val="clear"/>
+          <w:shd w:val="clear" w:color="auto" w:fill="auto"/>
         </w:rPr>
       </w:pPr>
       <w:r>
         <w:rPr>
           <w:sz w:val="18"/>
           <w:szCs w:val="18"/>
-          <w:shd w:val="clear"/>
+          <w:shd w:val="clear" w:color="auto" w:fill="auto"/>
         </w:rPr>
         <w:t xml:space="preserve">범위: actuation(micro:bit BLE·AI Hand 서보), picar(RPi4B 모터·LED), 보드 2대 네트워크와 실물 기동 스크립트</w:t>
       </w:r>
@@ -27095,14 +26997,14 @@
         </w:numPr>
         <w:spacing w:lineRule="auto" w:line="240" w:after="0"/>
         <w:rPr>
-          <w:shd w:val="clear"/>
+          <w:shd w:val="clear" w:color="auto" w:fill="auto"/>
         </w:rPr>
       </w:pPr>
       <w:r>
         <w:rPr>
           <w:sz w:val="18"/>
           <w:szCs w:val="18"/>
-          <w:shd w:val="clear"/>
+          <w:shd w:val="clear" w:color="auto" w:fill="auto"/>
         </w:rPr>
         <w:t xml:space="preserve">협업 경계: 판정 로직은 이동혁, 웹은 조은수(09-29~30 공백은 대행). 팀장으로 일정·회의록·멘토링 보고</w:t>
       </w:r>
@@ -27112,12 +27014,12 @@
         <w:pStyle w:val="PO163"/>
         <w:spacing w:before="90" w:after="20"/>
         <w:rPr>
-          <w:shd w:val="clear"/>
+          <w:shd w:val="clear" w:color="auto" w:fill="auto"/>
         </w:rPr>
       </w:pPr>
       <w:r>
         <w:rPr>
-          <w:shd w:val="clear"/>
+          <w:shd w:val="clear" w:color="auto" w:fill="auto"/>
         </w:rPr>
         <w:t xml:space="preserve">Situation / Task</w:t>
       </w:r>
@@ -27126,7 +27028,7 @@
       <w:pPr>
         <w:spacing w:lineRule="auto" w:line="240" w:after="30"/>
         <w:rPr>
-          <w:shd w:val="clear"/>
+          <w:shd w:val="clear" w:color="auto" w:fill="auto"/>
         </w:rPr>
       </w:pPr>
       <w:r>
@@ -27134,7 +27036,7 @@
           <w:b w:val="1"/>
           <w:sz w:val="18"/>
           <w:szCs w:val="18"/>
-          <w:shd w:val="clear"/>
+          <w:shd w:val="clear" w:color="auto" w:fill="auto"/>
         </w:rPr>
         <w:t xml:space="preserve">picar 정지 실패가 곧 안전 사고인 구조에서, 5주 안에 지연 목표를 실물로 증명해야 했다.</w:t>
       </w:r>
@@ -27148,14 +27050,14 @@
         </w:numPr>
         <w:spacing w:lineRule="auto" w:line="240" w:after="0"/>
         <w:rPr>
-          <w:shd w:val="clear"/>
+          <w:shd w:val="clear" w:color="auto" w:fill="auto"/>
         </w:rPr>
       </w:pPr>
       <w:r>
         <w:rPr>
           <w:sz w:val="18"/>
           <w:szCs w:val="18"/>
-          <w:shd w:val="clear"/>
+          <w:shd w:val="clear" w:color="auto" w:fill="auto"/>
         </w:rPr>
         <w:t xml:space="preserve">제약: RPi5 과열 86.2°C(09-25), micro:bit BLE와 소리 동시 사용 시 패닉, 모터 보드 문서 없음</w:t>
       </w:r>
@@ -27169,14 +27071,14 @@
         </w:numPr>
         <w:spacing w:lineRule="auto" w:line="240" w:after="0"/>
         <w:rPr>
-          <w:shd w:val="clear"/>
+          <w:shd w:val="clear" w:color="auto" w:fill="auto"/>
         </w:rPr>
       </w:pPr>
       <w:r>
         <w:rPr>
           <w:sz w:val="18"/>
           <w:szCs w:val="18"/>
-          <w:shd w:val="clear"/>
+          <w:shd w:val="clear" w:color="auto" w:fill="auto"/>
         </w:rPr>
         <w:t xml:space="preserve">목표: 물리 피드백 P95 ≤ 2.0초, 판정 지연 P95 ≤ 1.0초, 명령이 끊겨도 2초 안에 picar 자동 정지</w:t>
       </w:r>
@@ -27186,12 +27088,12 @@
         <w:pStyle w:val="PO163"/>
         <w:spacing w:before="90" w:after="20"/>
         <w:rPr>
-          <w:shd w:val="clear"/>
+          <w:shd w:val="clear" w:color="auto" w:fill="auto"/>
         </w:rPr>
       </w:pPr>
       <w:r>
         <w:rPr>
-          <w:shd w:val="clear"/>
+          <w:shd w:val="clear" w:color="auto" w:fill="auto"/>
         </w:rPr>
         <w:t>Action</w:t>
       </w:r>
@@ -27200,7 +27102,7 @@
       <w:pPr>
         <w:spacing w:lineRule="auto" w:line="240" w:after="30"/>
         <w:rPr>
-          <w:shd w:val="clear"/>
+          <w:shd w:val="clear" w:color="auto" w:fill="auto"/>
         </w:rPr>
       </w:pPr>
       <w:r>
@@ -27208,7 +27110,7 @@
           <w:b w:val="1"/>
           <w:sz w:val="18"/>
           <w:szCs w:val="18"/>
-          <w:shd w:val="clear"/>
+          <w:shd w:val="clear" w:color="auto" w:fill="auto"/>
         </w:rPr>
         <w:t xml:space="preserve">추정 대신 실물로 확인하고, 안전 경로부터 가장 엄격하게 시험했다.</w:t>
       </w:r>
@@ -27222,14 +27124,14 @@
         </w:numPr>
         <w:spacing w:lineRule="auto" w:line="240" w:after="0"/>
         <w:rPr>
-          <w:shd w:val="clear"/>
+          <w:shd w:val="clear" w:color="auto" w:fill="auto"/>
         </w:rPr>
       </w:pPr>
       <w:r>
         <w:rPr>
           <w:sz w:val="18"/>
           <w:szCs w:val="18"/>
-          <w:shd w:val="clear"/>
+          <w:shd w:val="clear" w:color="auto" w:fill="auto"/>
         </w:rPr>
         <w:t xml:space="preserve">분석·선택: 모터 I²C 프로토콜을 드라이버 소스에서 찾고, picar 속도 상한 50을 서버에서 강제</w:t>
       </w:r>
@@ -27243,14 +27145,14 @@
         </w:numPr>
         <w:spacing w:lineRule="auto" w:line="240" w:after="0"/>
         <w:rPr>
-          <w:shd w:val="clear"/>
+          <w:shd w:val="clear" w:color="auto" w:fill="auto"/>
         </w:rPr>
       </w:pPr>
       <w:r>
         <w:rPr>
           <w:sz w:val="18"/>
           <w:szCs w:val="18"/>
-          <w:shd w:val="clear"/>
+          <w:shd w:val="clear" w:color="auto" w:fill="auto"/>
         </w:rPr>
         <w:t xml:space="preserve">구현·시험: BLE 결함 6건 수정, 명령 지연 1424 → 37ms, picar 부하 시험, 09-25 첫 전 구간 통합</w:t>
       </w:r>
@@ -27264,14 +27166,14 @@
         </w:numPr>
         <w:spacing w:lineRule="auto" w:line="240" w:after="0"/>
         <w:rPr>
-          <w:shd w:val="clear"/>
+          <w:shd w:val="clear" w:color="auto" w:fill="auto"/>
         </w:rPr>
       </w:pPr>
       <w:r>
         <w:rPr>
           <w:sz w:val="18"/>
           <w:szCs w:val="18"/>
-          <w:shd w:val="clear"/>
+          <w:shd w:val="clear" w:color="auto" w:fill="auto"/>
         </w:rPr>
         <w:t xml:space="preserve">협업: web 판정 타이밍 스펙과 인수 테스트 22개를 구현보다 먼저 작성하고 web 할 일을 3명에게 나눴다</w:t>
       </w:r>
@@ -27281,12 +27183,12 @@
         <w:pStyle w:val="PO163"/>
         <w:spacing w:before="90" w:after="20"/>
         <w:rPr>
-          <w:shd w:val="clear"/>
+          <w:shd w:val="clear" w:color="auto" w:fill="auto"/>
         </w:rPr>
       </w:pPr>
       <w:r>
         <w:rPr>
-          <w:shd w:val="clear"/>
+          <w:shd w:val="clear" w:color="auto" w:fill="auto"/>
         </w:rPr>
         <w:t>Result</w:t>
       </w:r>
@@ -27295,7 +27197,7 @@
       <w:pPr>
         <w:spacing w:lineRule="auto" w:line="240" w:after="30"/>
         <w:rPr>
-          <w:shd w:val="clear"/>
+          <w:shd w:val="clear" w:color="auto" w:fill="auto"/>
         </w:rPr>
       </w:pPr>
       <w:r>
@@ -27303,7 +27205,7 @@
           <w:b w:val="1"/>
           <w:sz w:val="18"/>
           <w:szCs w:val="18"/>
-          <w:shd w:val="clear"/>
+          <w:shd w:val="clear" w:color="auto" w:fill="auto"/>
         </w:rPr>
         <w:t xml:space="preserve">지연 KPI 2개를 목표의 약 1/20 수준으로 달성했다.</w:t>
       </w:r>
@@ -27317,14 +27219,14 @@
         </w:numPr>
         <w:spacing w:lineRule="auto" w:line="240" w:after="0"/>
         <w:rPr>
-          <w:shd w:val="clear"/>
+          <w:shd w:val="clear" w:color="auto" w:fill="auto"/>
         </w:rPr>
       </w:pPr>
       <w:r>
         <w:rPr>
           <w:sz w:val="18"/>
           <w:szCs w:val="18"/>
-          <w:shd w:val="clear"/>
+          <w:shd w:val="clear" w:color="auto" w:fill="auto"/>
         </w:rPr>
         <w:t xml:space="preserve">판정 지연 P95 0.046초(목표 1.0초), 물리 피드백 반응 시작 P95 0.089초(목표 2.0초), 91시도 장치 실패 0건</w:t>
       </w:r>
@@ -27338,14 +27240,14 @@
         </w:numPr>
         <w:spacing w:lineRule="auto" w:line="240" w:after="0"/>
         <w:rPr>
-          <w:shd w:val="clear"/>
+          <w:shd w:val="clear" w:color="auto" w:fill="auto"/>
         </w:rPr>
       </w:pPr>
       <w:r>
         <w:rPr>
           <w:sz w:val="18"/>
           <w:szCs w:val="18"/>
-          <w:shd w:val="clear"/>
+          <w:shd w:val="clear" w:color="auto" w:fill="auto"/>
         </w:rPr>
         <w:t xml:space="preserve">시연 전 안전 결함 3건 차단(정지 실패, 속도 60 병합, 자동 정지 타이머 경쟁). W4 마감 안에 KPI 7개 측정 완료</w:t>
       </w:r>
@@ -27355,12 +27257,12 @@
         <w:pStyle w:val="PO163"/>
         <w:spacing w:before="90" w:after="20"/>
         <w:rPr>
-          <w:shd w:val="clear"/>
+          <w:shd w:val="clear" w:color="auto" w:fill="auto"/>
         </w:rPr>
       </w:pPr>
       <w:r>
         <w:rPr>
-          <w:shd w:val="clear"/>
+          <w:shd w:val="clear" w:color="auto" w:fill="auto"/>
         </w:rPr>
         <w:t xml:space="preserve">Issue &amp; Learning</w:t>
       </w:r>
@@ -27369,7 +27271,7 @@
       <w:pPr>
         <w:spacing w:lineRule="auto" w:line="240" w:after="30"/>
         <w:rPr>
-          <w:shd w:val="clear"/>
+          <w:shd w:val="clear" w:color="auto" w:fill="auto"/>
         </w:rPr>
       </w:pPr>
       <w:r>
@@ -27377,7 +27279,7 @@
           <w:b w:val="1"/>
           <w:sz w:val="18"/>
           <w:szCs w:val="18"/>
-          <w:shd w:val="clear"/>
+          <w:shd w:val="clear" w:color="auto" w:fill="auto"/>
         </w:rPr>
         <w:t xml:space="preserve">부하 시험에서 picar 정지 실패를 시연 전에 잡았지만, 측정 도구는 그 실패를 성공으로 기록하고 있었다.</w:t>
       </w:r>
@@ -27391,14 +27293,14 @@
         </w:numPr>
         <w:spacing w:lineRule="auto" w:line="240" w:after="0"/>
         <w:rPr>
-          <w:shd w:val="clear"/>
+          <w:shd w:val="clear" w:color="auto" w:fill="auto"/>
         </w:rPr>
       </w:pPr>
       <w:r>
         <w:rPr>
           <w:sz w:val="18"/>
           <w:szCs w:val="18"/>
-          <w:shd w:val="clear"/>
+          <w:shd w:val="clear" w:color="auto" w:fill="auto"/>
         </w:rPr>
         <w:t xml:space="preserve">조치: 정지가 성공한 뒤에 타이머를 걷도록 순서를 바꾸고 정지 재시도 3회와 회귀 테스트 4건을 넣었다</w:t>
       </w:r>
@@ -27412,14 +27314,14 @@
         </w:numPr>
         <w:spacing w:lineRule="auto" w:line="240" w:after="0"/>
         <w:rPr>
-          <w:shd w:val="clear"/>
+          <w:shd w:val="clear" w:color="auto" w:fill="auto"/>
         </w:rPr>
       </w:pPr>
       <w:r>
         <w:rPr>
           <w:sz w:val="18"/>
           <w:szCs w:val="18"/>
-          <w:shd w:val="clear"/>
+          <w:shd w:val="clear" w:color="auto" w:fill="auto"/>
         </w:rPr>
         <w:t xml:space="preserve">다음에는: 측정 도구도 "실패를 넣으면 실패가 나오는가"부터 시험하고, 지연 예산표를 먼저 만든다</w:t>
       </w:r>
@@ -27429,12 +27331,12 @@
         <w:pStyle w:val="PO163"/>
         <w:spacing w:before="90" w:after="20"/>
         <w:rPr>
-          <w:shd w:val="clear"/>
+          <w:shd w:val="clear" w:color="auto" w:fill="auto"/>
         </w:rPr>
       </w:pPr>
       <w:r>
         <w:rPr>
-          <w:shd w:val="clear"/>
+          <w:shd w:val="clear" w:color="auto" w:fill="auto"/>
         </w:rPr>
         <w:t xml:space="preserve">산출물 및 증거</w:t>
       </w:r>
@@ -27502,7 +27404,7 @@
                 <w:b w:val="1"/>
                 <w:sz w:val="18"/>
                 <w:szCs w:val="18"/>
-                <w:shd w:val="clear"/>
+                <w:shd w:val="clear" w:color="auto" w:fill="auto"/>
               </w:rPr>
               <w:t>구분</w:t>
             </w:r>
@@ -27539,7 +27441,7 @@
                 <w:b w:val="1"/>
                 <w:sz w:val="18"/>
                 <w:szCs w:val="18"/>
-                <w:shd w:val="clear"/>
+                <w:shd w:val="clear" w:color="auto" w:fill="auto"/>
               </w:rPr>
               <w:t>산출물/기여</w:t>
             </w:r>
@@ -27576,7 +27478,7 @@
                 <w:b w:val="1"/>
                 <w:sz w:val="18"/>
                 <w:szCs w:val="18"/>
-                <w:shd w:val="clear"/>
+                <w:shd w:val="clear" w:color="auto" w:fill="auto"/>
               </w:rPr>
               <w:t xml:space="preserve">근거 링크</w:t>
             </w:r>
@@ -27613,7 +27515,7 @@
                 <w:b w:val="1"/>
                 <w:sz w:val="18"/>
                 <w:szCs w:val="18"/>
-                <w:shd w:val="clear"/>
+                <w:shd w:val="clear" w:color="auto" w:fill="auto"/>
               </w:rPr>
               <w:t xml:space="preserve">관련 문서</w:t>
             </w:r>
@@ -27654,7 +27556,7 @@
               <w:rPr>
                 <w:sz w:val="18"/>
                 <w:szCs w:val="18"/>
-                <w:shd w:val="clear"/>
+                <w:shd w:val="clear" w:color="auto" w:fill="auto"/>
               </w:rPr>
               <w:t>기획</w:t>
             </w:r>
@@ -27689,7 +27591,7 @@
               <w:rPr>
                 <w:sz w:val="18"/>
                 <w:szCs w:val="18"/>
-                <w:shd w:val="clear"/>
+                <w:shd w:val="clear" w:color="auto" w:fill="auto"/>
               </w:rPr>
               <w:t xml:space="preserve">하드웨어 구성·전원·핀맵, KPI 측정 안건, 판정 타이밍 </w:t>
             </w:r>
@@ -27697,7 +27599,7 @@
               <w:rPr>
                 <w:sz w:val="18"/>
                 <w:szCs w:val="18"/>
-                <w:shd w:val="clear"/>
+                <w:shd w:val="clear" w:color="auto" w:fill="auto"/>
               </w:rPr>
               <w:t>스펙</w:t>
             </w:r>
@@ -27732,7 +27634,7 @@
               <w:rPr>
                 <w:sz w:val="18"/>
                 <w:szCs w:val="18"/>
-                <w:shd w:val="clear"/>
+                <w:shd w:val="clear" w:color="auto" w:fill="auto"/>
                 <w:rFonts w:ascii="Consolas" w:eastAsia="Malgun Gothic" w:hAnsi="Consolas" w:cs="Consolas"/>
               </w:rPr>
               <w:t>537be67</w:t>
@@ -27768,7 +27670,7 @@
               <w:rPr>
                 <w:sz w:val="18"/>
                 <w:szCs w:val="18"/>
-                <w:shd w:val="clear"/>
+                <w:shd w:val="clear" w:color="auto" w:fill="auto"/>
               </w:rPr>
               <w:t xml:space="preserve">11, 16</w:t>
             </w:r>
@@ -27809,7 +27711,7 @@
               <w:rPr>
                 <w:sz w:val="18"/>
                 <w:szCs w:val="18"/>
-                <w:shd w:val="clear"/>
+                <w:shd w:val="clear" w:color="auto" w:fill="auto"/>
               </w:rPr>
               <w:t>구현</w:t>
             </w:r>
@@ -27844,7 +27746,7 @@
               <w:rPr>
                 <w:sz w:val="18"/>
                 <w:szCs w:val="18"/>
-                <w:shd w:val="clear"/>
+                <w:shd w:val="clear" w:color="auto" w:fill="auto"/>
               </w:rPr>
               <w:t xml:space="preserve">actuation BLE·펌웨어, picar 제어, 실물 기동 스크립트</w:t>
             </w:r>
@@ -27879,7 +27781,7 @@
               <w:rPr>
                 <w:sz w:val="18"/>
                 <w:szCs w:val="18"/>
-                <w:shd w:val="clear"/>
+                <w:shd w:val="clear" w:color="auto" w:fill="auto"/>
                 <w:rFonts w:ascii="Consolas" w:eastAsia="Malgun Gothic" w:hAnsi="Consolas" w:cs="Consolas"/>
               </w:rPr>
               <w:t>7f13227</w:t>
@@ -27888,7 +27790,7 @@
               <w:rPr>
                 <w:sz w:val="18"/>
                 <w:szCs w:val="18"/>
-                <w:shd w:val="clear"/>
+                <w:shd w:val="clear" w:color="auto" w:fill="auto"/>
               </w:rPr>
               <w:t xml:space="preserve">, </w:t>
             </w:r>
@@ -27896,7 +27798,7 @@
               <w:rPr>
                 <w:sz w:val="18"/>
                 <w:szCs w:val="18"/>
-                <w:shd w:val="clear"/>
+                <w:shd w:val="clear" w:color="auto" w:fill="auto"/>
                 <w:rFonts w:ascii="Consolas" w:eastAsia="Malgun Gothic" w:hAnsi="Consolas" w:cs="Consolas"/>
               </w:rPr>
               <w:t>899f6ba</w:t>
@@ -27932,7 +27834,7 @@
               <w:rPr>
                 <w:sz w:val="18"/>
                 <w:szCs w:val="18"/>
-                <w:shd w:val="clear"/>
+                <w:shd w:val="clear" w:color="auto" w:fill="auto"/>
               </w:rPr>
               <w:t xml:space="preserve">11, 13, 17</w:t>
             </w:r>
@@ -27973,7 +27875,7 @@
               <w:rPr>
                 <w:sz w:val="18"/>
                 <w:szCs w:val="18"/>
-                <w:shd w:val="clear"/>
+                <w:shd w:val="clear" w:color="auto" w:fill="auto"/>
               </w:rPr>
               <w:t>시험</w:t>
             </w:r>
@@ -28008,7 +27910,7 @@
               <w:rPr>
                 <w:sz w:val="18"/>
                 <w:szCs w:val="18"/>
-                <w:shd w:val="clear"/>
+                <w:shd w:val="clear" w:color="auto" w:fill="auto"/>
               </w:rPr>
               <w:t xml:space="preserve">picar 부하 시험, 전 구간 통합, 지연 KPI 91시도</w:t>
             </w:r>
@@ -28043,7 +27945,7 @@
               <w:rPr>
                 <w:sz w:val="18"/>
                 <w:szCs w:val="18"/>
-                <w:shd w:val="clear"/>
+                <w:shd w:val="clear" w:color="auto" w:fill="auto"/>
                 <w:rFonts w:ascii="Consolas" w:eastAsia="Malgun Gothic" w:hAnsi="Consolas" w:cs="Consolas"/>
               </w:rPr>
               <w:t>63edaee</w:t>
@@ -28052,7 +27954,7 @@
               <w:rPr>
                 <w:sz w:val="18"/>
                 <w:szCs w:val="18"/>
-                <w:shd w:val="clear"/>
+                <w:shd w:val="clear" w:color="auto" w:fill="auto"/>
               </w:rPr>
               <w:t xml:space="preserve">, </w:t>
             </w:r>
@@ -28060,7 +27962,7 @@
               <w:rPr>
                 <w:sz w:val="18"/>
                 <w:szCs w:val="18"/>
-                <w:shd w:val="clear"/>
+                <w:shd w:val="clear" w:color="auto" w:fill="auto"/>
                 <w:rFonts w:ascii="Consolas" w:eastAsia="Malgun Gothic" w:hAnsi="Consolas" w:cs="Consolas"/>
               </w:rPr>
               <w:t>d3a209e</w:t>
@@ -28096,7 +27998,7 @@
               <w:rPr>
                 <w:sz w:val="18"/>
                 <w:szCs w:val="18"/>
-                <w:shd w:val="clear"/>
+                <w:shd w:val="clear" w:color="auto" w:fill="auto"/>
               </w:rPr>
               <w:t xml:space="preserve">06 §2, 13</w:t>
             </w:r>
@@ -28137,7 +28039,7 @@
               <w:rPr>
                 <w:sz w:val="18"/>
                 <w:szCs w:val="18"/>
-                <w:shd w:val="clear"/>
+                <w:shd w:val="clear" w:color="auto" w:fill="auto"/>
               </w:rPr>
               <w:t>문서/발표</w:t>
             </w:r>
@@ -28172,7 +28074,7 @@
               <w:rPr>
                 <w:sz w:val="18"/>
                 <w:szCs w:val="18"/>
-                <w:shd w:val="clear"/>
+                <w:shd w:val="clear" w:color="auto" w:fill="auto"/>
               </w:rPr>
               <w:t xml:space="preserve">15 개발로그, 11·13·16·17, 22 목표정의서</w:t>
             </w:r>
@@ -28207,7 +28109,7 @@
               <w:rPr>
                 <w:sz w:val="18"/>
                 <w:szCs w:val="18"/>
-                <w:shd w:val="clear"/>
+                <w:shd w:val="clear" w:color="auto" w:fill="auto"/>
                 <w:rFonts w:ascii="Consolas" w:eastAsia="Malgun Gothic" w:hAnsi="Consolas" w:cs="Consolas"/>
               </w:rPr>
               <w:t>85af519</w:t>
@@ -28216,7 +28118,7 @@
               <w:rPr>
                 <w:sz w:val="18"/>
                 <w:szCs w:val="18"/>
-                <w:shd w:val="clear"/>
+                <w:shd w:val="clear" w:color="auto" w:fill="auto"/>
               </w:rPr>
               <w:t xml:space="preserve">, </w:t>
             </w:r>
@@ -28224,7 +28126,7 @@
               <w:rPr>
                 <w:sz w:val="18"/>
                 <w:szCs w:val="18"/>
-                <w:shd w:val="clear"/>
+                <w:shd w:val="clear" w:color="auto" w:fill="auto"/>
                 <w:rFonts w:ascii="Consolas" w:eastAsia="Malgun Gothic" w:hAnsi="Consolas" w:cs="Consolas"/>
               </w:rPr>
               <w:t>2946907</w:t>
@@ -28260,7 +28162,7 @@
               <w:rPr>
                 <w:sz w:val="18"/>
                 <w:szCs w:val="18"/>
-                <w:shd w:val="clear"/>
+                <w:shd w:val="clear" w:color="auto" w:fill="auto"/>
               </w:rPr>
               <w:t xml:space="preserve">15, 22</w:t>
             </w:r>
@@ -28272,7 +28174,7 @@
       <w:pPr>
         <w:spacing w:lineRule="exact" w:line="120" w:after="0"/>
         <w:rPr>
-          <w:shd w:val="clear"/>
+          <w:shd w:val="clear" w:color="auto" w:fill="auto"/>
         </w:rPr>
       </w:pPr>
     </w:p>
@@ -28282,35 +28184,21 @@
         <w:spacing w:before="0" w:after="160"/>
         <w:pageBreakBefore w:val="1"/>
         <w:rPr>
-          <w:shd w:val="clear"/>
+          <w:shd w:val="clear" w:color="auto" w:fill="auto"/>
         </w:rPr>
       </w:pPr>
       <w:r>
         <w:rPr>
-          <w:shd w:val="clear"/>
+          <w:shd w:val="clear" w:color="auto" w:fill="auto"/>
         </w:rPr>
         <w:t xml:space="preserve">별첨 2. 개인 역할 기술서</w:t>
       </w:r>
       <w:r>
         <w:rPr>
-          <w:shd w:val="clear"/>
+          <w:shd w:val="clear" w:color="auto" w:fill="auto"/>
           <w:lang w:eastAsia="ko-KR"/>
         </w:rPr>
-        <w:t xml:space="preserve"> -</w:t>
-      </w:r>
-      <w:r>
-        <w:rPr>
-          <w:shd w:val="clear"/>
-          <w:lang w:eastAsia="ko-KR"/>
-        </w:rPr>
-        <w:t xml:space="preserve"> 이동</w:t>
-      </w:r>
-      <w:r>
-        <w:rPr>
-          <w:shd w:val="clear"/>
-          <w:lang w:eastAsia="ko-KR"/>
-        </w:rPr>
-        <w:t>혁</w:t>
+        <w:t xml:space="preserve"> - 이동혁</w:t>
       </w:r>
     </w:p>
     <w:tbl>
@@ -28376,7 +28264,7 @@
                 <w:b w:val="1"/>
                 <w:sz w:val="18"/>
                 <w:szCs w:val="18"/>
-                <w:shd w:val="clear"/>
+                <w:shd w:val="clear" w:color="auto" w:fill="auto"/>
               </w:rPr>
               <w:t>이름</w:t>
             </w:r>
@@ -28411,7 +28299,7 @@
               <w:rPr>
                 <w:sz w:val="18"/>
                 <w:szCs w:val="18"/>
-                <w:shd w:val="clear"/>
+                <w:shd w:val="clear" w:color="auto" w:fill="auto"/>
               </w:rPr>
               <w:t>이동혁</w:t>
             </w:r>
@@ -28448,7 +28336,7 @@
                 <w:b w:val="1"/>
                 <w:sz w:val="18"/>
                 <w:szCs w:val="18"/>
-                <w:shd w:val="clear"/>
+                <w:shd w:val="clear" w:color="auto" w:fill="auto"/>
               </w:rPr>
               <w:t>팀</w:t>
             </w:r>
@@ -28483,7 +28371,7 @@
               <w:rPr>
                 <w:sz w:val="18"/>
                 <w:szCs w:val="18"/>
-                <w:shd w:val="clear"/>
+                <w:shd w:val="clear" w:color="auto" w:fill="auto"/>
               </w:rPr>
               <w:t>심기일전</w:t>
             </w:r>
@@ -28526,7 +28414,7 @@
                 <w:b w:val="1"/>
                 <w:sz w:val="18"/>
                 <w:szCs w:val="18"/>
-                <w:shd w:val="clear"/>
+                <w:shd w:val="clear" w:color="auto" w:fill="auto"/>
               </w:rPr>
               <w:t xml:space="preserve">담당 역할</w:t>
             </w:r>
@@ -28561,7 +28449,7 @@
               <w:rPr>
                 <w:sz w:val="18"/>
                 <w:szCs w:val="18"/>
-                <w:shd w:val="clear"/>
+                <w:shd w:val="clear" w:color="auto" w:fill="auto"/>
               </w:rPr>
               <w:t xml:space="preserve">파이프라인·판정 로직 R · 보고 R · 요구사항·하드웨어·웹 </w:t>
             </w:r>
@@ -28569,7 +28457,7 @@
               <w:rPr>
                 <w:sz w:val="18"/>
                 <w:szCs w:val="18"/>
-                <w:shd w:val="clear"/>
+                <w:shd w:val="clear" w:color="auto" w:fill="auto"/>
               </w:rPr>
               <w:t>A</w:t>
             </w:r>
@@ -28606,7 +28494,7 @@
                 <w:b w:val="1"/>
                 <w:sz w:val="18"/>
                 <w:szCs w:val="18"/>
-                <w:shd w:val="clear"/>
+                <w:shd w:val="clear" w:color="auto" w:fill="auto"/>
               </w:rPr>
               <w:t>프로젝트</w:t>
             </w:r>
@@ -28641,7 +28529,7 @@
               <w:rPr>
                 <w:sz w:val="18"/>
                 <w:szCs w:val="18"/>
-                <w:shd w:val="clear"/>
+                <w:shd w:val="clear" w:color="auto" w:fill="auto"/>
               </w:rPr>
               <w:t xml:space="preserve">SafeSign PhysicalAI</w:t>
             </w:r>
@@ -28684,7 +28572,7 @@
                 <w:b w:val="1"/>
                 <w:sz w:val="18"/>
                 <w:szCs w:val="18"/>
-                <w:shd w:val="clear"/>
+                <w:shd w:val="clear" w:color="auto" w:fill="auto"/>
               </w:rPr>
               <w:t>수행기간</w:t>
             </w:r>
@@ -28719,7 +28607,7 @@
               <w:rPr>
                 <w:sz w:val="18"/>
                 <w:szCs w:val="18"/>
-                <w:shd w:val="clear"/>
+                <w:shd w:val="clear" w:color="auto" w:fill="auto"/>
               </w:rPr>
               <w:t xml:space="preserve">2026-09-04 ~ 10-12 (W1~W5)</w:t>
             </w:r>
@@ -28756,7 +28644,7 @@
                 <w:b w:val="1"/>
                 <w:sz w:val="18"/>
                 <w:szCs w:val="18"/>
-                <w:shd w:val="clear"/>
+                <w:shd w:val="clear" w:color="auto" w:fill="auto"/>
               </w:rPr>
               <w:t>작성일</w:t>
             </w:r>
@@ -28791,7 +28679,7 @@
               <w:rPr>
                 <w:sz w:val="18"/>
                 <w:szCs w:val="18"/>
-                <w:shd w:val="clear"/>
+                <w:shd w:val="clear" w:color="auto" w:fill="auto"/>
               </w:rPr>
               <w:t>2026-10-06</w:t>
             </w:r>
@@ -28803,7 +28691,7 @@
       <w:pPr>
         <w:spacing w:lineRule="exact" w:line="120" w:after="0"/>
         <w:rPr>
-          <w:shd w:val="clear"/>
+          <w:shd w:val="clear" w:color="auto" w:fill="auto"/>
         </w:rPr>
       </w:pPr>
     </w:p>
@@ -28812,12 +28700,12 @@
         <w:pStyle w:val="PO163"/>
         <w:spacing w:before="90" w:after="20"/>
         <w:rPr>
-          <w:shd w:val="clear"/>
+          <w:shd w:val="clear" w:color="auto" w:fill="auto"/>
         </w:rPr>
       </w:pPr>
       <w:r>
         <w:rPr>
-          <w:shd w:val="clear"/>
+          <w:shd w:val="clear" w:color="auto" w:fill="auto"/>
         </w:rPr>
         <w:t xml:space="preserve">책임 요약</w:t>
       </w:r>
@@ -28826,7 +28714,7 @@
       <w:pPr>
         <w:spacing w:lineRule="auto" w:line="240" w:after="30"/>
         <w:rPr>
-          <w:shd w:val="clear"/>
+          <w:shd w:val="clear" w:color="auto" w:fill="auto"/>
         </w:rPr>
       </w:pPr>
       <w:r>
@@ -28834,7 +28722,7 @@
           <w:b w:val="1"/>
           <w:sz w:val="18"/>
           <w:szCs w:val="18"/>
-          <w:shd w:val="clear"/>
+          <w:shd w:val="clear" w:color="auto" w:fill="auto"/>
         </w:rPr>
         <w:t xml:space="preserve">카메라 영상에서 수신호 7종을 판정하는 비전 파이프라인 전체를 설계·학습하고, 판정 성능 KPI 5개를 측정했다.</w:t>
       </w:r>
@@ -28848,14 +28736,14 @@
         </w:numPr>
         <w:spacing w:lineRule="auto" w:line="240" w:after="0"/>
         <w:rPr>
-          <w:shd w:val="clear"/>
+          <w:shd w:val="clear" w:color="auto" w:fill="auto"/>
         </w:rPr>
       </w:pPr>
       <w:r>
         <w:rPr>
           <w:sz w:val="18"/>
           <w:szCs w:val="18"/>
-          <w:shd w:val="clear"/>
+          <w:shd w:val="clear" w:color="auto" w:fill="auto"/>
         </w:rPr>
         <w:t xml:space="preserve">범위: 랜드마크 → 특징 23차원 → SVM → 소속 게이트·3연속 판정, RPi5 실시간 판정</w:t>
       </w:r>
@@ -28869,14 +28757,14 @@
         </w:numPr>
         <w:spacing w:lineRule="auto" w:line="240" w:after="0"/>
         <w:rPr>
-          <w:shd w:val="clear"/>
+          <w:shd w:val="clear" w:color="auto" w:fill="auto"/>
         </w:rPr>
       </w:pPr>
       <w:r>
         <w:rPr>
           <w:sz w:val="18"/>
           <w:szCs w:val="18"/>
-          <w:shd w:val="clear"/>
+          <w:shd w:val="clear" w:color="auto" w:fill="auto"/>
         </w:rPr>
         <w:t xml:space="preserve">웹 A: 판정 로직 백엔드, 회원 DB, 회사 웹사이트(제안·구현), 화면 디자인 수정</w:t>
       </w:r>
@@ -28890,14 +28778,14 @@
         </w:numPr>
         <w:spacing w:lineRule="auto" w:line="240" w:after="0"/>
         <w:rPr>
-          <w:shd w:val="clear"/>
+          <w:shd w:val="clear" w:color="auto" w:fill="auto"/>
         </w:rPr>
       </w:pPr>
       <w:r>
         <w:rPr>
           <w:sz w:val="18"/>
           <w:szCs w:val="18"/>
-          <w:shd w:val="clear"/>
+          <w:shd w:val="clear" w:color="auto" w:fill="auto"/>
         </w:rPr>
         <w:t xml:space="preserve">협업 경계: 학습 데이터는 김지훈, 지연 측정은 송승호, 화면 첫 구현은 조은수</w:t>
       </w:r>
@@ -28907,12 +28795,12 @@
         <w:pStyle w:val="PO163"/>
         <w:spacing w:before="90" w:after="20"/>
         <w:rPr>
-          <w:shd w:val="clear"/>
+          <w:shd w:val="clear" w:color="auto" w:fill="auto"/>
         </w:rPr>
       </w:pPr>
       <w:r>
         <w:rPr>
-          <w:shd w:val="clear"/>
+          <w:shd w:val="clear" w:color="auto" w:fill="auto"/>
         </w:rPr>
         <w:t xml:space="preserve">Situation / Task</w:t>
       </w:r>
@@ -28921,7 +28809,7 @@
       <w:pPr>
         <w:spacing w:lineRule="auto" w:line="240" w:after="30"/>
         <w:rPr>
-          <w:shd w:val="clear"/>
+          <w:shd w:val="clear" w:color="auto" w:fill="auto"/>
         </w:rPr>
       </w:pPr>
       <w:r>
@@ -28929,7 +28817,7 @@
           <w:b w:val="1"/>
           <w:sz w:val="18"/>
           <w:szCs w:val="18"/>
-          <w:shd w:val="clear"/>
+          <w:shd w:val="clear" w:color="auto" w:fill="auto"/>
         </w:rPr>
         <w:t xml:space="preserve">우리 수신호 데이터가 없어, 손 모양만 빌린 데이터로 시험지 오염 없이 KPI 5개를 맞춰야 했다.</w:t>
       </w:r>
@@ -28943,14 +28831,14 @@
         </w:numPr>
         <w:spacing w:lineRule="auto" w:line="240" w:after="0"/>
         <w:rPr>
-          <w:shd w:val="clear"/>
+          <w:shd w:val="clear" w:color="auto" w:fill="auto"/>
         </w:rPr>
       </w:pPr>
       <w:r>
         <w:rPr>
           <w:sz w:val="18"/>
           <w:szCs w:val="18"/>
-          <w:shd w:val="clear"/>
+          <w:shd w:val="clear" w:color="auto" w:fill="auto"/>
         </w:rPr>
         <w:t xml:space="preserve">제약: 공개 데이터의 97.7%가 805개 세션에 묶임(복사본·연속 촬영), RPi5 CPU 실시간</w:t>
       </w:r>
@@ -28964,14 +28852,14 @@
         </w:numPr>
         <w:spacing w:lineRule="auto" w:line="240" w:after="0"/>
         <w:rPr>
-          <w:shd w:val="clear"/>
+          <w:shd w:val="clear" w:color="auto" w:fill="auto"/>
         </w:rPr>
       </w:pPr>
       <w:r>
         <w:rPr>
           <w:sz w:val="18"/>
           <w:szCs w:val="18"/>
-          <w:shd w:val="clear"/>
+          <w:shd w:val="clear" w:color="auto" w:fill="auto"/>
         </w:rPr>
         <w:t xml:space="preserve">목표: 정답률 ≥ 92%, 오분류율 ≤ 3%, 미판정률 ≤ 5%, Macro F1 ≥ 0.90, 치명 오분류 0건</w:t>
       </w:r>
@@ -28981,12 +28869,12 @@
         <w:pStyle w:val="PO163"/>
         <w:spacing w:before="90" w:after="20"/>
         <w:rPr>
-          <w:shd w:val="clear"/>
+          <w:shd w:val="clear" w:color="auto" w:fill="auto"/>
         </w:rPr>
       </w:pPr>
       <w:r>
         <w:rPr>
-          <w:shd w:val="clear"/>
+          <w:shd w:val="clear" w:color="auto" w:fill="auto"/>
         </w:rPr>
         <w:t>Action</w:t>
       </w:r>
@@ -28995,7 +28883,7 @@
       <w:pPr>
         <w:spacing w:lineRule="auto" w:line="240" w:after="30"/>
         <w:rPr>
-          <w:shd w:val="clear"/>
+          <w:shd w:val="clear" w:color="auto" w:fill="auto"/>
         </w:rPr>
       </w:pPr>
       <w:r>
@@ -29003,7 +28891,7 @@
           <w:b w:val="1"/>
           <w:sz w:val="18"/>
           <w:szCs w:val="18"/>
-          <w:shd w:val="clear"/>
+          <w:shd w:val="clear" w:color="auto" w:fill="auto"/>
         </w:rPr>
         <w:t xml:space="preserve">너무 좋은 숫자를 의심하고, 감 대신 계산으로 골랐다.</w:t>
       </w:r>
@@ -29017,14 +28905,14 @@
         </w:numPr>
         <w:spacing w:lineRule="auto" w:line="240" w:after="0"/>
         <w:rPr>
-          <w:shd w:val="clear"/>
+          <w:shd w:val="clear" w:color="auto" w:fill="auto"/>
         </w:rPr>
       </w:pPr>
       <w:r>
         <w:rPr>
           <w:sz w:val="18"/>
           <w:szCs w:val="18"/>
-          <w:shd w:val="clear"/>
+          <w:shd w:val="clear" w:color="auto" w:fill="auto"/>
         </w:rPr>
         <w:t xml:space="preserve">분석: 98.81%를 의심해 세션 누수를 찾아 세션 단위 분할로 고정(77.57%), 특징을 관절 23차원으로 바꿔 88.68%</w:t>
       </w:r>
@@ -29038,14 +28926,14 @@
         </w:numPr>
         <w:spacing w:lineRule="auto" w:line="240" w:after="0"/>
         <w:rPr>
-          <w:shd w:val="clear"/>
+          <w:shd w:val="clear" w:color="auto" w:fill="auto"/>
         </w:rPr>
       </w:pPr>
       <w:r>
         <w:rPr>
           <w:sz w:val="18"/>
           <w:szCs w:val="18"/>
-          <w:shd w:val="clear"/>
+          <w:shd w:val="clear" w:color="auto" w:fill="auto"/>
         </w:rPr>
         <w:t xml:space="preserve">선택: 낯선 손을 거르는 소속 게이트, 불리한 3연속 규칙을 공식 판정으로, 딥러닝 비교 뒤 SVM 유지</w:t>
       </w:r>
@@ -29059,14 +28947,14 @@
         </w:numPr>
         <w:spacing w:lineRule="auto" w:line="240" w:after="0"/>
         <w:rPr>
-          <w:shd w:val="clear"/>
+          <w:shd w:val="clear" w:color="auto" w:fill="auto"/>
         </w:rPr>
       </w:pPr>
       <w:r>
         <w:rPr>
           <w:sz w:val="18"/>
           <w:szCs w:val="18"/>
-          <w:shd w:val="clear"/>
+          <w:shd w:val="clear" w:color="auto" w:fill="auto"/>
         </w:rPr>
         <w:t xml:space="preserve">협업: 송승호의 스펙과 인수 테스트 22개로 web 백엔드를 구현하고, 장치 호출 순서를 바꿨다</w:t>
       </w:r>
@@ -29076,12 +28964,12 @@
         <w:pStyle w:val="PO163"/>
         <w:spacing w:before="90" w:after="20"/>
         <w:rPr>
-          <w:shd w:val="clear"/>
+          <w:shd w:val="clear" w:color="auto" w:fill="auto"/>
         </w:rPr>
       </w:pPr>
       <w:r>
         <w:rPr>
-          <w:shd w:val="clear"/>
+          <w:shd w:val="clear" w:color="auto" w:fill="auto"/>
         </w:rPr>
         <w:t>Result</w:t>
       </w:r>
@@ -29090,7 +28978,7 @@
       <w:pPr>
         <w:spacing w:lineRule="auto" w:line="240" w:after="30"/>
         <w:rPr>
-          <w:shd w:val="clear"/>
+          <w:shd w:val="clear" w:color="auto" w:fill="auto"/>
         </w:rPr>
       </w:pPr>
       <w:r>
@@ -29098,7 +28986,7 @@
           <w:b w:val="1"/>
           <w:sz w:val="18"/>
           <w:szCs w:val="18"/>
-          <w:shd w:val="clear"/>
+          <w:shd w:val="clear" w:color="auto" w:fill="auto"/>
         </w:rPr>
         <w:t xml:space="preserve">판정 성능 5개를 모두 달성했다(3개는 잠정 달성).</w:t>
       </w:r>
@@ -29112,14 +29000,14 @@
         </w:numPr>
         <w:spacing w:lineRule="auto" w:line="240" w:after="0"/>
         <w:rPr>
-          <w:shd w:val="clear"/>
+          <w:shd w:val="clear" w:color="auto" w:fill="auto"/>
         </w:rPr>
       </w:pPr>
       <w:r>
         <w:rPr>
           <w:sz w:val="18"/>
           <w:szCs w:val="18"/>
-          <w:shd w:val="clear"/>
+          <w:shd w:val="clear" w:color="auto" w:fill="auto"/>
         </w:rPr>
         <w:t xml:space="preserve">정답률 95.2% · 오분류율 0.0% · 미판정률 4.8% · Macro F1 0.974 · 치명 오분류 0건(팀원 3명 210시도)</w:t>
       </w:r>
@@ -29133,14 +29021,14 @@
         </w:numPr>
         <w:spacing w:lineRule="auto" w:line="240" w:after="0"/>
         <w:rPr>
-          <w:shd w:val="clear"/>
+          <w:shd w:val="clear" w:color="auto" w:fill="auto"/>
         </w:rPr>
       </w:pPr>
       <w:r>
         <w:rPr>
           <w:sz w:val="18"/>
           <w:szCs w:val="18"/>
-          <w:shd w:val="clear"/>
+          <w:shd w:val="clear" w:color="auto" w:fill="auto"/>
         </w:rPr>
         <w:t xml:space="preserve">RPi5 판정 26.6fps. 시행 로그 CSV가 지연 KPI 원본이 됐고, 장치 반응 0.85초 지연 구조를 없앴다</w:t>
       </w:r>
@@ -29150,12 +29038,12 @@
         <w:pStyle w:val="PO163"/>
         <w:spacing w:before="90" w:after="20"/>
         <w:rPr>
-          <w:shd w:val="clear"/>
+          <w:shd w:val="clear" w:color="auto" w:fill="auto"/>
         </w:rPr>
       </w:pPr>
       <w:r>
         <w:rPr>
-          <w:shd w:val="clear"/>
+          <w:shd w:val="clear" w:color="auto" w:fill="auto"/>
         </w:rPr>
         <w:t xml:space="preserve">Issue &amp; Learning</w:t>
       </w:r>
@@ -29164,7 +29052,7 @@
       <w:pPr>
         <w:spacing w:lineRule="auto" w:line="240" w:after="30"/>
         <w:rPr>
-          <w:shd w:val="clear"/>
+          <w:shd w:val="clear" w:color="auto" w:fill="auto"/>
         </w:rPr>
       </w:pPr>
       <w:r>
@@ -29172,7 +29060,7 @@
           <w:b w:val="1"/>
           <w:sz w:val="18"/>
           <w:szCs w:val="18"/>
-          <w:shd w:val="clear"/>
+          <w:shd w:val="clear" w:color="auto" w:fill="auto"/>
         </w:rPr>
         <w:t xml:space="preserve">웹캠 정답률 28.2%는 모델이 아니라 측정 도구의 결함이었다.</w:t>
       </w:r>
@@ -29186,14 +29074,14 @@
         </w:numPr>
         <w:spacing w:lineRule="auto" w:line="240" w:after="0"/>
         <w:rPr>
-          <w:shd w:val="clear"/>
+          <w:shd w:val="clear" w:color="auto" w:fill="auto"/>
         </w:rPr>
       </w:pPr>
       <w:r>
         <w:rPr>
           <w:sz w:val="18"/>
           <w:szCs w:val="18"/>
-          <w:shd w:val="clear"/>
+          <w:shd w:val="clear" w:color="auto" w:fill="auto"/>
         </w:rPr>
         <w:t xml:space="preserve">조치: 이전 모델로 같은 프레임을 재판정해 원인을 가르고, 새 촬영 도구로 105프레임 전부 정답 확인</w:t>
       </w:r>
@@ -29207,14 +29095,14 @@
         </w:numPr>
         <w:spacing w:lineRule="auto" w:line="240" w:after="0"/>
         <w:rPr>
-          <w:shd w:val="clear"/>
+          <w:shd w:val="clear" w:color="auto" w:fill="auto"/>
         </w:rPr>
       </w:pPr>
       <w:r>
         <w:rPr>
           <w:sz w:val="18"/>
           <w:szCs w:val="18"/>
-          <w:shd w:val="clear"/>
+          <w:shd w:val="clear" w:color="auto" w:fill="auto"/>
         </w:rPr>
         <w:t xml:space="preserve">다음에는: 측정 도구부터 정답을 아는 입력으로 검증하고, 조정용 촬영과 평가용 촬영을 처음부터 나눈다</w:t>
       </w:r>
@@ -29224,12 +29112,12 @@
         <w:pStyle w:val="PO163"/>
         <w:spacing w:before="90" w:after="20"/>
         <w:rPr>
-          <w:shd w:val="clear"/>
+          <w:shd w:val="clear" w:color="auto" w:fill="auto"/>
         </w:rPr>
       </w:pPr>
       <w:r>
         <w:rPr>
-          <w:shd w:val="clear"/>
+          <w:shd w:val="clear" w:color="auto" w:fill="auto"/>
         </w:rPr>
         <w:t xml:space="preserve">산출물 및 증거</w:t>
       </w:r>
@@ -29297,7 +29185,7 @@
                 <w:b w:val="1"/>
                 <w:sz w:val="18"/>
                 <w:szCs w:val="18"/>
-                <w:shd w:val="clear"/>
+                <w:shd w:val="clear" w:color="auto" w:fill="auto"/>
               </w:rPr>
               <w:t>구분</w:t>
             </w:r>
@@ -29334,7 +29222,7 @@
                 <w:b w:val="1"/>
                 <w:sz w:val="18"/>
                 <w:szCs w:val="18"/>
-                <w:shd w:val="clear"/>
+                <w:shd w:val="clear" w:color="auto" w:fill="auto"/>
               </w:rPr>
               <w:t>산출물/기여</w:t>
             </w:r>
@@ -29371,7 +29259,7 @@
                 <w:b w:val="1"/>
                 <w:sz w:val="18"/>
                 <w:szCs w:val="18"/>
-                <w:shd w:val="clear"/>
+                <w:shd w:val="clear" w:color="auto" w:fill="auto"/>
               </w:rPr>
               <w:t xml:space="preserve">근거 링크</w:t>
             </w:r>
@@ -29408,7 +29296,7 @@
                 <w:b w:val="1"/>
                 <w:sz w:val="18"/>
                 <w:szCs w:val="18"/>
-                <w:shd w:val="clear"/>
+                <w:shd w:val="clear" w:color="auto" w:fill="auto"/>
               </w:rPr>
               <w:t xml:space="preserve">관련 문서</w:t>
             </w:r>
@@ -29449,7 +29337,7 @@
               <w:rPr>
                 <w:sz w:val="18"/>
                 <w:szCs w:val="18"/>
-                <w:shd w:val="clear"/>
+                <w:shd w:val="clear" w:color="auto" w:fill="auto"/>
               </w:rPr>
               <w:t>기획</w:t>
             </w:r>
@@ -29484,7 +29372,7 @@
               <w:rPr>
                 <w:sz w:val="18"/>
                 <w:szCs w:val="18"/>
-                <w:shd w:val="clear"/>
+                <w:shd w:val="clear" w:color="auto" w:fill="auto"/>
               </w:rPr>
               <w:t xml:space="preserve">저장소 초기 구성, PRD 초안, 회사 사이트 제안</w:t>
             </w:r>
@@ -29519,7 +29407,7 @@
               <w:rPr>
                 <w:sz w:val="18"/>
                 <w:szCs w:val="18"/>
-                <w:shd w:val="clear"/>
+                <w:shd w:val="clear" w:color="auto" w:fill="auto"/>
                 <w:rFonts w:ascii="Consolas" w:eastAsia="Malgun Gothic" w:hAnsi="Consolas" w:cs="Consolas"/>
               </w:rPr>
               <w:t>1b76bf0</w:t>
@@ -29528,7 +29416,7 @@
               <w:rPr>
                 <w:sz w:val="18"/>
                 <w:szCs w:val="18"/>
-                <w:shd w:val="clear"/>
+                <w:shd w:val="clear" w:color="auto" w:fill="auto"/>
               </w:rPr>
               <w:t xml:space="preserve">, </w:t>
             </w:r>
@@ -29536,7 +29424,7 @@
               <w:rPr>
                 <w:sz w:val="18"/>
                 <w:szCs w:val="18"/>
-                <w:shd w:val="clear"/>
+                <w:shd w:val="clear" w:color="auto" w:fill="auto"/>
                 <w:rFonts w:ascii="Consolas" w:eastAsia="Malgun Gothic" w:hAnsi="Consolas" w:cs="Consolas"/>
               </w:rPr>
               <w:t>3b54dd5</w:t>
@@ -29572,7 +29460,7 @@
               <w:rPr>
                 <w:sz w:val="18"/>
                 <w:szCs w:val="18"/>
-                <w:shd w:val="clear"/>
+                <w:shd w:val="clear" w:color="auto" w:fill="auto"/>
               </w:rPr>
               <w:t xml:space="preserve">10, 19</w:t>
             </w:r>
@@ -29613,7 +29501,7 @@
               <w:rPr>
                 <w:sz w:val="18"/>
                 <w:szCs w:val="18"/>
-                <w:shd w:val="clear"/>
+                <w:shd w:val="clear" w:color="auto" w:fill="auto"/>
               </w:rPr>
               <w:t>구현</w:t>
             </w:r>
@@ -29648,7 +29536,7 @@
               <w:rPr>
                 <w:sz w:val="18"/>
                 <w:szCs w:val="18"/>
-                <w:shd w:val="clear"/>
+                <w:shd w:val="clear" w:color="auto" w:fill="auto"/>
               </w:rPr>
               <w:t xml:space="preserve">vision 학습·게이트·실시간 판정, web 판정 로직, 회원 DB</w:t>
             </w:r>
@@ -29683,7 +29571,7 @@
               <w:rPr>
                 <w:sz w:val="18"/>
                 <w:szCs w:val="18"/>
-                <w:shd w:val="clear"/>
+                <w:shd w:val="clear" w:color="auto" w:fill="auto"/>
                 <w:rFonts w:ascii="Consolas" w:eastAsia="Malgun Gothic" w:hAnsi="Consolas" w:cs="Consolas"/>
               </w:rPr>
               <w:t>50fb5b1</w:t>
@@ -29692,7 +29580,7 @@
               <w:rPr>
                 <w:sz w:val="18"/>
                 <w:szCs w:val="18"/>
-                <w:shd w:val="clear"/>
+                <w:shd w:val="clear" w:color="auto" w:fill="auto"/>
               </w:rPr>
               <w:t xml:space="preserve">, </w:t>
             </w:r>
@@ -29700,7 +29588,7 @@
               <w:rPr>
                 <w:sz w:val="18"/>
                 <w:szCs w:val="18"/>
-                <w:shd w:val="clear"/>
+                <w:shd w:val="clear" w:color="auto" w:fill="auto"/>
                 <w:rFonts w:ascii="Consolas" w:eastAsia="Malgun Gothic" w:hAnsi="Consolas" w:cs="Consolas"/>
               </w:rPr>
               <w:t>c8f1fd3</w:t>
@@ -29736,7 +29624,7 @@
               <w:rPr>
                 <w:sz w:val="18"/>
                 <w:szCs w:val="18"/>
-                <w:shd w:val="clear"/>
+                <w:shd w:val="clear" w:color="auto" w:fill="auto"/>
               </w:rPr>
               <w:t xml:space="preserve">05, 14, 18</w:t>
             </w:r>
@@ -29777,7 +29665,7 @@
               <w:rPr>
                 <w:sz w:val="18"/>
                 <w:szCs w:val="18"/>
-                <w:shd w:val="clear"/>
+                <w:shd w:val="clear" w:color="auto" w:fill="auto"/>
               </w:rPr>
               <w:t>시험</w:t>
             </w:r>
@@ -29812,7 +29700,7 @@
               <w:rPr>
                 <w:sz w:val="18"/>
                 <w:szCs w:val="18"/>
-                <w:shd w:val="clear"/>
+                <w:shd w:val="clear" w:color="auto" w:fill="auto"/>
               </w:rPr>
               <w:t xml:space="preserve">최종 오프라인 KPI 210시도, 딥러닝 비교 연구</w:t>
             </w:r>
@@ -29847,7 +29735,7 @@
               <w:rPr>
                 <w:sz w:val="18"/>
                 <w:szCs w:val="18"/>
-                <w:shd w:val="clear"/>
+                <w:shd w:val="clear" w:color="auto" w:fill="auto"/>
                 <w:rFonts w:ascii="Consolas" w:eastAsia="Malgun Gothic" w:hAnsi="Consolas" w:cs="Consolas"/>
               </w:rPr>
               <w:t>1676128</w:t>
@@ -29856,7 +29744,7 @@
               <w:rPr>
                 <w:sz w:val="18"/>
                 <w:szCs w:val="18"/>
-                <w:shd w:val="clear"/>
+                <w:shd w:val="clear" w:color="auto" w:fill="auto"/>
               </w:rPr>
               <w:t xml:space="preserve">, </w:t>
             </w:r>
@@ -29864,7 +29752,7 @@
               <w:rPr>
                 <w:sz w:val="18"/>
                 <w:szCs w:val="18"/>
-                <w:shd w:val="clear"/>
+                <w:shd w:val="clear" w:color="auto" w:fill="auto"/>
                 <w:rFonts w:ascii="Consolas" w:eastAsia="Malgun Gothic" w:hAnsi="Consolas" w:cs="Consolas"/>
               </w:rPr>
               <w:t>b0bd7c0</w:t>
@@ -29900,7 +29788,7 @@
               <w:rPr>
                 <w:sz w:val="18"/>
                 <w:szCs w:val="18"/>
-                <w:shd w:val="clear"/>
+                <w:shd w:val="clear" w:color="auto" w:fill="auto"/>
               </w:rPr>
               <w:t xml:space="preserve">06 §2-1, 12</w:t>
             </w:r>
@@ -29941,7 +29829,7 @@
               <w:rPr>
                 <w:sz w:val="18"/>
                 <w:szCs w:val="18"/>
-                <w:shd w:val="clear"/>
+                <w:shd w:val="clear" w:color="auto" w:fill="auto"/>
               </w:rPr>
               <w:t>문서/발표</w:t>
             </w:r>
@@ -29976,7 +29864,7 @@
               <w:rPr>
                 <w:sz w:val="18"/>
                 <w:szCs w:val="18"/>
-                <w:shd w:val="clear"/>
+                <w:shd w:val="clear" w:color="auto" w:fill="auto"/>
               </w:rPr>
               <w:t xml:space="preserve">05 모델카드, 12 AI 비전 진행보고서, 18·19 신설</w:t>
             </w:r>
@@ -30011,7 +29899,7 @@
               <w:rPr>
                 <w:sz w:val="18"/>
                 <w:szCs w:val="18"/>
-                <w:shd w:val="clear"/>
+                <w:shd w:val="clear" w:color="auto" w:fill="auto"/>
                 <w:rFonts w:ascii="Consolas" w:eastAsia="Malgun Gothic" w:hAnsi="Consolas" w:cs="Consolas"/>
               </w:rPr>
               <w:t>72ecd37</w:t>
@@ -30020,7 +29908,7 @@
               <w:rPr>
                 <w:sz w:val="18"/>
                 <w:szCs w:val="18"/>
-                <w:shd w:val="clear"/>
+                <w:shd w:val="clear" w:color="auto" w:fill="auto"/>
               </w:rPr>
               <w:t xml:space="preserve">, </w:t>
             </w:r>
@@ -30028,7 +29916,7 @@
               <w:rPr>
                 <w:sz w:val="18"/>
                 <w:szCs w:val="18"/>
-                <w:shd w:val="clear"/>
+                <w:shd w:val="clear" w:color="auto" w:fill="auto"/>
                 <w:rFonts w:ascii="Consolas" w:eastAsia="Malgun Gothic" w:hAnsi="Consolas" w:cs="Consolas"/>
               </w:rPr>
               <w:t>08712e1</w:t>
@@ -30064,7 +29952,7 @@
               <w:rPr>
                 <w:sz w:val="18"/>
                 <w:szCs w:val="18"/>
-                <w:shd w:val="clear"/>
+                <w:shd w:val="clear" w:color="auto" w:fill="auto"/>
               </w:rPr>
               <w:t xml:space="preserve">05, 12, 18, 19</w:t>
             </w:r>
@@ -30076,7 +29964,7 @@
       <w:pPr>
         <w:spacing w:lineRule="exact" w:line="120" w:after="0"/>
         <w:rPr>
-          <w:shd w:val="clear"/>
+          <w:shd w:val="clear" w:color="auto" w:fill="auto"/>
         </w:rPr>
       </w:pPr>
     </w:p>
@@ -30086,35 +29974,21 @@
         <w:spacing w:before="0" w:after="160"/>
         <w:pageBreakBefore w:val="1"/>
         <w:rPr>
-          <w:shd w:val="clear"/>
+          <w:shd w:val="clear" w:color="auto" w:fill="auto"/>
         </w:rPr>
       </w:pPr>
       <w:r>
         <w:rPr>
-          <w:shd w:val="clear"/>
+          <w:shd w:val="clear" w:color="auto" w:fill="auto"/>
         </w:rPr>
         <w:t xml:space="preserve">별첨 3. 개인 역할 기술서</w:t>
       </w:r>
       <w:r>
         <w:rPr>
-          <w:shd w:val="clear"/>
+          <w:shd w:val="clear" w:color="auto" w:fill="auto"/>
           <w:lang w:eastAsia="ko-KR"/>
         </w:rPr>
-        <w:t xml:space="preserve"> </w:t>
-      </w:r>
-      <w:r>
-        <w:rPr>
-          <w:shd w:val="clear"/>
-          <w:lang w:eastAsia="ko-KR"/>
-        </w:rPr>
-        <w:t xml:space="preserve">- 조은</w:t>
-      </w:r>
-      <w:r>
-        <w:rPr>
-          <w:shd w:val="clear"/>
-          <w:lang w:eastAsia="ko-KR"/>
-        </w:rPr>
-        <w:t>수</w:t>
+        <w:t xml:space="preserve"> - 조은수</w:t>
       </w:r>
     </w:p>
     <w:tbl>
@@ -30180,7 +30054,7 @@
                 <w:b w:val="1"/>
                 <w:sz w:val="18"/>
                 <w:szCs w:val="18"/>
-                <w:shd w:val="clear"/>
+                <w:shd w:val="clear" w:color="auto" w:fill="auto"/>
               </w:rPr>
               <w:t>이름</w:t>
             </w:r>
@@ -30215,7 +30089,7 @@
               <w:rPr>
                 <w:sz w:val="18"/>
                 <w:szCs w:val="18"/>
-                <w:shd w:val="clear"/>
+                <w:shd w:val="clear" w:color="auto" w:fill="auto"/>
               </w:rPr>
               <w:t>조은수</w:t>
             </w:r>
@@ -30252,7 +30126,7 @@
                 <w:b w:val="1"/>
                 <w:sz w:val="18"/>
                 <w:szCs w:val="18"/>
-                <w:shd w:val="clear"/>
+                <w:shd w:val="clear" w:color="auto" w:fill="auto"/>
               </w:rPr>
               <w:t>팀</w:t>
             </w:r>
@@ -30287,7 +30161,7 @@
               <w:rPr>
                 <w:sz w:val="18"/>
                 <w:szCs w:val="18"/>
-                <w:shd w:val="clear"/>
+                <w:shd w:val="clear" w:color="auto" w:fill="auto"/>
               </w:rPr>
               <w:t>심기일전</w:t>
             </w:r>
@@ -30330,7 +30204,7 @@
                 <w:b w:val="1"/>
                 <w:sz w:val="18"/>
                 <w:szCs w:val="18"/>
-                <w:shd w:val="clear"/>
+                <w:shd w:val="clear" w:color="auto" w:fill="auto"/>
               </w:rPr>
               <w:t xml:space="preserve">담당 역할</w:t>
             </w:r>
@@ -30365,7 +30239,7 @@
               <w:rPr>
                 <w:sz w:val="18"/>
                 <w:szCs w:val="18"/>
-                <w:shd w:val="clear"/>
+                <w:shd w:val="clear" w:color="auto" w:fill="auto"/>
               </w:rPr>
               <w:t xml:space="preserve">웹 R · 성능측정 R · 보고 R</w:t>
             </w:r>
@@ -30402,7 +30276,7 @@
                 <w:b w:val="1"/>
                 <w:sz w:val="18"/>
                 <w:szCs w:val="18"/>
-                <w:shd w:val="clear"/>
+                <w:shd w:val="clear" w:color="auto" w:fill="auto"/>
               </w:rPr>
               <w:t>프로젝트</w:t>
             </w:r>
@@ -30437,7 +30311,7 @@
               <w:rPr>
                 <w:sz w:val="18"/>
                 <w:szCs w:val="18"/>
-                <w:shd w:val="clear"/>
+                <w:shd w:val="clear" w:color="auto" w:fill="auto"/>
               </w:rPr>
               <w:t xml:space="preserve">SafeSign PhysicalAI</w:t>
             </w:r>
@@ -30480,7 +30354,7 @@
                 <w:b w:val="1"/>
                 <w:sz w:val="18"/>
                 <w:szCs w:val="18"/>
-                <w:shd w:val="clear"/>
+                <w:shd w:val="clear" w:color="auto" w:fill="auto"/>
               </w:rPr>
               <w:t>수행기간</w:t>
             </w:r>
@@ -30515,7 +30389,7 @@
               <w:rPr>
                 <w:sz w:val="18"/>
                 <w:szCs w:val="18"/>
-                <w:shd w:val="clear"/>
+                <w:shd w:val="clear" w:color="auto" w:fill="auto"/>
               </w:rPr>
               <w:t xml:space="preserve">2026-09-04 ~ 10-12 (W1~W5)</w:t>
             </w:r>
@@ -30552,7 +30426,7 @@
                 <w:b w:val="1"/>
                 <w:sz w:val="18"/>
                 <w:szCs w:val="18"/>
-                <w:shd w:val="clear"/>
+                <w:shd w:val="clear" w:color="auto" w:fill="auto"/>
               </w:rPr>
               <w:t>작성일</w:t>
             </w:r>
@@ -30587,7 +30461,7 @@
               <w:rPr>
                 <w:sz w:val="18"/>
                 <w:szCs w:val="18"/>
-                <w:shd w:val="clear"/>
+                <w:shd w:val="clear" w:color="auto" w:fill="auto"/>
               </w:rPr>
               <w:t>2026-10-06</w:t>
             </w:r>
@@ -30599,7 +30473,7 @@
       <w:pPr>
         <w:spacing w:lineRule="exact" w:line="120" w:after="0"/>
         <w:rPr>
-          <w:shd w:val="clear"/>
+          <w:shd w:val="clear" w:color="auto" w:fill="auto"/>
         </w:rPr>
       </w:pPr>
     </w:p>
@@ -30608,12 +30482,12 @@
         <w:pStyle w:val="PO163"/>
         <w:spacing w:before="90" w:after="20"/>
         <w:rPr>
-          <w:shd w:val="clear"/>
+          <w:shd w:val="clear" w:color="auto" w:fill="auto"/>
         </w:rPr>
       </w:pPr>
       <w:r>
         <w:rPr>
-          <w:shd w:val="clear"/>
+          <w:shd w:val="clear" w:color="auto" w:fill="auto"/>
         </w:rPr>
         <w:t xml:space="preserve">책임 요약</w:t>
       </w:r>
@@ -30622,7 +30496,7 @@
       <w:pPr>
         <w:spacing w:lineRule="auto" w:line="240" w:after="30"/>
         <w:rPr>
-          <w:shd w:val="clear"/>
+          <w:shd w:val="clear" w:color="auto" w:fill="auto"/>
         </w:rPr>
       </w:pPr>
       <w:r>
@@ -30630,7 +30504,7 @@
           <w:b w:val="1"/>
           <w:sz w:val="18"/>
           <w:szCs w:val="18"/>
-          <w:shd w:val="clear"/>
+          <w:shd w:val="clear" w:color="auto" w:fill="auto"/>
         </w:rPr>
         <w:t xml:space="preserve">교육 화면과 상태머신을 처음 구현했고, 온라인 지연 KPI를 계산한 집계 도구를 만들었다.</w:t>
       </w:r>
@@ -30644,14 +30518,14 @@
         </w:numPr>
         <w:spacing w:lineRule="auto" w:line="240" w:after="0"/>
         <w:rPr>
-          <w:shd w:val="clear"/>
+          <w:shd w:val="clear" w:color="auto" w:fill="auto"/>
         </w:rPr>
       </w:pPr>
       <w:r>
         <w:rPr>
           <w:sz w:val="18"/>
           <w:szCs w:val="18"/>
-          <w:shd w:val="clear"/>
+          <w:shd w:val="clear" w:color="auto" w:fill="auto"/>
         </w:rPr>
         <w:t xml:space="preserve">범위: SC-01~SC-07 화면·상태머신 첫 구현(09-22), 장치 실패 감지, KPI 집계 스크립트, 화면 캡처</w:t>
       </w:r>
@@ -30665,14 +30539,14 @@
         </w:numPr>
         <w:spacing w:lineRule="auto" w:line="240" w:after="0"/>
         <w:rPr>
-          <w:shd w:val="clear"/>
+          <w:shd w:val="clear" w:color="auto" w:fill="auto"/>
         </w:rPr>
       </w:pPr>
       <w:r>
         <w:rPr>
           <w:sz w:val="18"/>
           <w:szCs w:val="18"/>
-          <w:shd w:val="clear"/>
+          <w:shd w:val="clear" w:color="auto" w:fill="auto"/>
         </w:rPr>
         <w:t xml:space="preserve">협업 경계: 판정 로직과 새 화면 디자인은 이동혁, 측정·집계 실행은 송승호(09-30 재배정)</w:t>
       </w:r>
@@ -30682,12 +30556,12 @@
         <w:pStyle w:val="PO163"/>
         <w:spacing w:before="90" w:after="20"/>
         <w:rPr>
-          <w:shd w:val="clear"/>
+          <w:shd w:val="clear" w:color="auto" w:fill="auto"/>
         </w:rPr>
       </w:pPr>
       <w:r>
         <w:rPr>
-          <w:shd w:val="clear"/>
+          <w:shd w:val="clear" w:color="auto" w:fill="auto"/>
         </w:rPr>
         <w:t xml:space="preserve">Situation / Task</w:t>
       </w:r>
@@ -30696,7 +30570,7 @@
       <w:pPr>
         <w:spacing w:lineRule="auto" w:line="240" w:after="30"/>
         <w:rPr>
-          <w:shd w:val="clear"/>
+          <w:shd w:val="clear" w:color="auto" w:fill="auto"/>
         </w:rPr>
       </w:pPr>
       <w:r>
@@ -30704,7 +30578,7 @@
           <w:b w:val="1"/>
           <w:sz w:val="18"/>
           <w:szCs w:val="18"/>
-          <w:shd w:val="clear"/>
+          <w:shd w:val="clear" w:color="auto" w:fill="auto"/>
         </w:rPr>
         <w:t xml:space="preserve">다른 서비스 셋을 모두 부르는 web을, 장치 실측값이 나오기 전부터 만들어야 했다.</w:t>
       </w:r>
@@ -30718,14 +30592,14 @@
         </w:numPr>
         <w:spacing w:lineRule="auto" w:line="240" w:after="0"/>
         <w:rPr>
-          <w:shd w:val="clear"/>
+          <w:shd w:val="clear" w:color="auto" w:fill="auto"/>
         </w:rPr>
       </w:pPr>
       <w:r>
         <w:rPr>
           <w:sz w:val="18"/>
           <w:szCs w:val="18"/>
-          <w:shd w:val="clear"/>
+          <w:shd w:val="clear" w:color="auto" w:fill="auto"/>
         </w:rPr>
         <w:t xml:space="preserve">제약: 09-22 출발 시 SC-01 정적 화면뿐, picar 속도와 actuation 응답 시간은 미확정, 09-30 화면 교체</w:t>
       </w:r>
@@ -30739,14 +30613,14 @@
         </w:numPr>
         <w:spacing w:lineRule="auto" w:line="240" w:after="0"/>
         <w:rPr>
-          <w:shd w:val="clear"/>
+          <w:shd w:val="clear" w:color="auto" w:fill="auto"/>
         </w:rPr>
       </w:pPr>
       <w:r>
         <w:rPr>
           <w:sz w:val="18"/>
           <w:szCs w:val="18"/>
-          <w:shd w:val="clear"/>
+          <w:shd w:val="clear" w:color="auto" w:fill="auto"/>
         </w:rPr>
         <w:t xml:space="preserve">목표: 시작부터 수료증까지 화면이 이어지고, 장치 실패를 web이 알아채며, 지연 KPI를 정해진 규칙대로 집계</w:t>
       </w:r>
@@ -30756,12 +30630,12 @@
         <w:pStyle w:val="PO163"/>
         <w:spacing w:before="90" w:after="20"/>
         <w:rPr>
-          <w:shd w:val="clear"/>
+          <w:shd w:val="clear" w:color="auto" w:fill="auto"/>
         </w:rPr>
       </w:pPr>
       <w:r>
         <w:rPr>
-          <w:shd w:val="clear"/>
+          <w:shd w:val="clear" w:color="auto" w:fill="auto"/>
         </w:rPr>
         <w:t>Action</w:t>
       </w:r>
@@ -30770,7 +30644,7 @@
       <w:pPr>
         <w:spacing w:lineRule="auto" w:line="240" w:after="30"/>
         <w:rPr>
-          <w:shd w:val="clear"/>
+          <w:shd w:val="clear" w:color="auto" w:fill="auto"/>
         </w:rPr>
       </w:pPr>
       <w:r>
@@ -30778,7 +30652,7 @@
           <w:b w:val="1"/>
           <w:sz w:val="18"/>
           <w:szCs w:val="18"/>
-          <w:shd w:val="clear"/>
+          <w:shd w:val="clear" w:color="auto" w:fill="auto"/>
         </w:rPr>
         <w:t xml:space="preserve">장치가 조용히 실패하는 구조부터 막고, 실측이 나오면 바로 값을 바꿨다.</w:t>
       </w:r>
@@ -30792,14 +30666,14 @@
         </w:numPr>
         <w:spacing w:lineRule="auto" w:line="240" w:after="0"/>
         <w:rPr>
-          <w:shd w:val="clear"/>
+          <w:shd w:val="clear" w:color="auto" w:fill="auto"/>
         </w:rPr>
       </w:pPr>
       <w:r>
         <w:rPr>
           <w:sz w:val="18"/>
           <w:szCs w:val="18"/>
-          <w:shd w:val="clear"/>
+          <w:shd w:val="clear" w:color="auto" w:fill="auto"/>
         </w:rPr>
         <w:t xml:space="preserve">구현: 장치 응답 4xx/5xx를 실패로 판정해 화면 상태에 노출, 정답 뒤 vision 초기화, 미판정 사유별 안내 구분</w:t>
       </w:r>
@@ -30813,14 +30687,14 @@
         </w:numPr>
         <w:spacing w:lineRule="auto" w:line="240" w:after="0"/>
         <w:rPr>
-          <w:shd w:val="clear"/>
+          <w:shd w:val="clear" w:color="auto" w:fill="auto"/>
         </w:rPr>
       </w:pPr>
       <w:r>
         <w:rPr>
           <w:sz w:val="18"/>
           <w:szCs w:val="18"/>
-          <w:shd w:val="clear"/>
+          <w:shd w:val="clear" w:color="auto" w:fill="auto"/>
         </w:rPr>
         <w:t xml:space="preserve">선택·시험: 실측에 맞춘 엔드포인트별 타임아웃, SC-04 25회·"첫 시도 정답" 지표, web 첫 단위 테스트</w:t>
       </w:r>
@@ -30834,14 +30708,14 @@
         </w:numPr>
         <w:spacing w:lineRule="auto" w:line="240" w:after="0"/>
         <w:rPr>
-          <w:shd w:val="clear"/>
+          <w:shd w:val="clear" w:color="auto" w:fill="auto"/>
         </w:rPr>
       </w:pPr>
       <w:r>
         <w:rPr>
           <w:sz w:val="18"/>
           <w:szCs w:val="18"/>
-          <w:shd w:val="clear"/>
+          <w:shd w:val="clear" w:color="auto" w:fill="auto"/>
         </w:rPr>
         <w:t xml:space="preserve">협업: 09-25 실물 통합에 참여하고, </w:t>
       </w:r>
@@ -30849,7 +30723,7 @@
         <w:rPr>
           <w:sz w:val="18"/>
           <w:szCs w:val="18"/>
-          <w:shd w:val="clear"/>
+          <w:shd w:val="clear" w:color="auto" w:fill="auto"/>
           <w:rFonts w:ascii="Consolas" w:eastAsia="Malgun Gothic" w:hAnsi="Consolas" w:cs="Consolas"/>
         </w:rPr>
         <w:t>dev</w:t>
@@ -30858,7 +30732,7 @@
         <w:rPr>
           <w:sz w:val="18"/>
           <w:szCs w:val="18"/>
-          <w:shd w:val="clear"/>
+          <w:shd w:val="clear" w:color="auto" w:fill="auto"/>
         </w:rPr>
         <w:t xml:space="preserve"> 병합 때 김지훈·송승호 작업을 살려 충돌을 해결했다</w:t>
       </w:r>
@@ -30868,12 +30742,12 @@
         <w:pStyle w:val="PO163"/>
         <w:spacing w:before="90" w:after="20"/>
         <w:rPr>
-          <w:shd w:val="clear"/>
+          <w:shd w:val="clear" w:color="auto" w:fill="auto"/>
         </w:rPr>
       </w:pPr>
       <w:r>
         <w:rPr>
-          <w:shd w:val="clear"/>
+          <w:shd w:val="clear" w:color="auto" w:fill="auto"/>
         </w:rPr>
         <w:t>Result</w:t>
       </w:r>
@@ -30882,7 +30756,7 @@
       <w:pPr>
         <w:spacing w:lineRule="auto" w:line="240" w:after="30"/>
         <w:rPr>
-          <w:shd w:val="clear"/>
+          <w:shd w:val="clear" w:color="auto" w:fill="auto"/>
         </w:rPr>
       </w:pPr>
       <w:r>
@@ -30890,7 +30764,7 @@
           <w:b w:val="1"/>
           <w:sz w:val="18"/>
           <w:szCs w:val="18"/>
-          <w:shd w:val="clear"/>
+          <w:shd w:val="clear" w:color="auto" w:fill="auto"/>
         </w:rPr>
         <w:t xml:space="preserve">이 집계 도구로 지연 KPI 2개가 집계돼 팀 KPI 7개가 모두 점추정 달성했다.</w:t>
       </w:r>
@@ -30904,14 +30778,14 @@
         </w:numPr>
         <w:spacing w:lineRule="auto" w:line="240" w:after="0"/>
         <w:rPr>
-          <w:shd w:val="clear"/>
+          <w:shd w:val="clear" w:color="auto" w:fill="auto"/>
         </w:rPr>
       </w:pPr>
       <w:r>
         <w:rPr>
           <w:sz w:val="18"/>
           <w:szCs w:val="18"/>
-          <w:shd w:val="clear"/>
+          <w:shd w:val="clear" w:color="auto" w:fill="auto"/>
         </w:rPr>
         <w:t xml:space="preserve">지연 P95 0.046초·0.089초 집계(실행은 송승호), 장치 호출 최악 대기 13초 → 약 6초</w:t>
       </w:r>
@@ -30925,14 +30799,14 @@
         </w:numPr>
         <w:spacing w:lineRule="auto" w:line="240" w:after="0"/>
         <w:rPr>
-          <w:shd w:val="clear"/>
+          <w:shd w:val="clear" w:color="auto" w:fill="auto"/>
         </w:rPr>
       </w:pPr>
       <w:r>
         <w:rPr>
           <w:sz w:val="18"/>
           <w:szCs w:val="18"/>
-          <w:shd w:val="clear"/>
+          <w:shd w:val="clear" w:color="auto" w:fill="auto"/>
         </w:rPr>
         <w:t xml:space="preserve">화면 캡처 19장이 결과보고서에 인용됐고, 장치 실패 감지·SC-04 분기 구조는 화면 교체 뒤에도 코드에 남았다</w:t>
       </w:r>
@@ -30942,12 +30816,12 @@
         <w:pStyle w:val="PO163"/>
         <w:spacing w:before="90" w:after="20"/>
         <w:rPr>
-          <w:shd w:val="clear"/>
+          <w:shd w:val="clear" w:color="auto" w:fill="auto"/>
         </w:rPr>
       </w:pPr>
       <w:r>
         <w:rPr>
-          <w:shd w:val="clear"/>
+          <w:shd w:val="clear" w:color="auto" w:fill="auto"/>
         </w:rPr>
         <w:t xml:space="preserve">Issue &amp; Learning</w:t>
       </w:r>
@@ -30956,7 +30830,7 @@
       <w:pPr>
         <w:spacing w:lineRule="auto" w:line="240" w:after="30"/>
         <w:rPr>
-          <w:shd w:val="clear"/>
+          <w:shd w:val="clear" w:color="auto" w:fill="auto"/>
         </w:rPr>
       </w:pPr>
       <w:r>
@@ -30964,7 +30838,7 @@
           <w:b w:val="1"/>
           <w:sz w:val="18"/>
           <w:szCs w:val="18"/>
-          <w:shd w:val="clear"/>
+          <w:shd w:val="clear" w:color="auto" w:fill="auto"/>
         </w:rPr>
         <w:t xml:space="preserve">실측 전 잠정값(타임아웃 0.6초, picar 회전 속도 60)을 넣었다가 실측 뒤 교체했다.</w:t>
       </w:r>
@@ -30978,14 +30852,14 @@
         </w:numPr>
         <w:spacing w:lineRule="auto" w:line="240" w:after="0"/>
         <w:rPr>
-          <w:shd w:val="clear"/>
+          <w:shd w:val="clear" w:color="auto" w:fill="auto"/>
         </w:rPr>
       </w:pPr>
       <w:r>
         <w:rPr>
           <w:sz w:val="18"/>
           <w:szCs w:val="18"/>
-          <w:shd w:val="clear"/>
+          <w:shd w:val="clear" w:color="auto" w:fill="auto"/>
         </w:rPr>
         <w:t xml:space="preserve">조치: 0.6초면 모든 제스처 명령이 시간 초과라, 09-25 실측값으로 바꿔 첫 전 구간 통합에 넣었다</w:t>
       </w:r>
@@ -30999,14 +30873,14 @@
         </w:numPr>
         <w:spacing w:lineRule="auto" w:line="240" w:after="0"/>
         <w:rPr>
-          <w:shd w:val="clear"/>
+          <w:shd w:val="clear" w:color="auto" w:fill="auto"/>
         </w:rPr>
       </w:pPr>
       <w:r>
         <w:rPr>
           <w:sz w:val="18"/>
           <w:szCs w:val="18"/>
-          <w:shd w:val="clear"/>
+          <w:shd w:val="clear" w:color="auto" w:fill="auto"/>
         </w:rPr>
         <w:t xml:space="preserve">다음에는: 실측이 필요한 값은 "잠정" 표시·실측 요청부터 하고, 화면마다 RPi5 실물로 확인한다</w:t>
       </w:r>
@@ -31016,12 +30890,12 @@
         <w:pStyle w:val="PO163"/>
         <w:spacing w:before="90" w:after="20"/>
         <w:rPr>
-          <w:shd w:val="clear"/>
+          <w:shd w:val="clear" w:color="auto" w:fill="auto"/>
         </w:rPr>
       </w:pPr>
       <w:r>
         <w:rPr>
-          <w:shd w:val="clear"/>
+          <w:shd w:val="clear" w:color="auto" w:fill="auto"/>
         </w:rPr>
         <w:t xml:space="preserve">산출물 및 증거</w:t>
       </w:r>
@@ -31089,7 +30963,7 @@
                 <w:b w:val="1"/>
                 <w:sz w:val="18"/>
                 <w:szCs w:val="18"/>
-                <w:shd w:val="clear"/>
+                <w:shd w:val="clear" w:color="auto" w:fill="auto"/>
               </w:rPr>
               <w:t>구분</w:t>
             </w:r>
@@ -31126,7 +31000,7 @@
                 <w:b w:val="1"/>
                 <w:sz w:val="18"/>
                 <w:szCs w:val="18"/>
-                <w:shd w:val="clear"/>
+                <w:shd w:val="clear" w:color="auto" w:fill="auto"/>
               </w:rPr>
               <w:t>산출물/기여</w:t>
             </w:r>
@@ -31163,7 +31037,7 @@
                 <w:b w:val="1"/>
                 <w:sz w:val="18"/>
                 <w:szCs w:val="18"/>
-                <w:shd w:val="clear"/>
+                <w:shd w:val="clear" w:color="auto" w:fill="auto"/>
               </w:rPr>
               <w:t xml:space="preserve">근거 링크</w:t>
             </w:r>
@@ -31200,7 +31074,7 @@
                 <w:b w:val="1"/>
                 <w:sz w:val="18"/>
                 <w:szCs w:val="18"/>
-                <w:shd w:val="clear"/>
+                <w:shd w:val="clear" w:color="auto" w:fill="auto"/>
               </w:rPr>
               <w:t xml:space="preserve">관련 문서</w:t>
             </w:r>
@@ -31241,7 +31115,7 @@
               <w:rPr>
                 <w:sz w:val="18"/>
                 <w:szCs w:val="18"/>
-                <w:shd w:val="clear"/>
+                <w:shd w:val="clear" w:color="auto" w:fill="auto"/>
               </w:rPr>
               <w:t>기획</w:t>
             </w:r>
@@ -31276,7 +31150,7 @@
               <w:rPr>
                 <w:sz w:val="18"/>
                 <w:szCs w:val="18"/>
-                <w:shd w:val="clear"/>
+                <w:shd w:val="clear" w:color="auto" w:fill="auto"/>
               </w:rPr>
               <w:t xml:space="preserve">결정 2건(첫 시도 정답, SC-04 25회), 시연영상 제안서 </w:t>
             </w:r>
@@ -31284,7 +31158,7 @@
               <w:rPr>
                 <w:sz w:val="18"/>
                 <w:szCs w:val="18"/>
-                <w:shd w:val="clear"/>
+                <w:shd w:val="clear" w:color="auto" w:fill="auto"/>
               </w:rPr>
               <w:t>초안</w:t>
             </w:r>
@@ -31319,7 +31193,7 @@
               <w:rPr>
                 <w:sz w:val="18"/>
                 <w:szCs w:val="18"/>
-                <w:shd w:val="clear"/>
+                <w:shd w:val="clear" w:color="auto" w:fill="auto"/>
                 <w:rFonts w:ascii="Consolas" w:eastAsia="Malgun Gothic" w:hAnsi="Consolas" w:cs="Consolas"/>
               </w:rPr>
               <w:t>554a10c</w:t>
@@ -31328,7 +31202,7 @@
               <w:rPr>
                 <w:sz w:val="18"/>
                 <w:szCs w:val="18"/>
-                <w:shd w:val="clear"/>
+                <w:shd w:val="clear" w:color="auto" w:fill="auto"/>
               </w:rPr>
               <w:t xml:space="preserve">, </w:t>
             </w:r>
@@ -31336,7 +31210,7 @@
               <w:rPr>
                 <w:sz w:val="18"/>
                 <w:szCs w:val="18"/>
-                <w:shd w:val="clear"/>
+                <w:shd w:val="clear" w:color="auto" w:fill="auto"/>
                 <w:rFonts w:ascii="Consolas" w:eastAsia="Malgun Gothic" w:hAnsi="Consolas" w:cs="Consolas"/>
               </w:rPr>
               <w:t>f5249c7</w:t>
@@ -31372,7 +31246,7 @@
               <w:rPr>
                 <w:sz w:val="18"/>
                 <w:szCs w:val="18"/>
-                <w:shd w:val="clear"/>
+                <w:shd w:val="clear" w:color="auto" w:fill="auto"/>
               </w:rPr>
               <w:t xml:space="preserve">09, 14 §9</w:t>
             </w:r>
@@ -31413,7 +31287,7 @@
               <w:rPr>
                 <w:sz w:val="18"/>
                 <w:szCs w:val="18"/>
-                <w:shd w:val="clear"/>
+                <w:shd w:val="clear" w:color="auto" w:fill="auto"/>
               </w:rPr>
               <w:t>구현</w:t>
             </w:r>
@@ -31448,7 +31322,7 @@
               <w:rPr>
                 <w:sz w:val="18"/>
                 <w:szCs w:val="18"/>
-                <w:shd w:val="clear"/>
+                <w:shd w:val="clear" w:color="auto" w:fill="auto"/>
               </w:rPr>
               <w:t xml:space="preserve">상태머신·SC-01~SC-07 첫 구현, 실측값 반영, 캡처 도구</w:t>
             </w:r>
@@ -31483,7 +31357,7 @@
               <w:rPr>
                 <w:sz w:val="18"/>
                 <w:szCs w:val="18"/>
-                <w:shd w:val="clear"/>
+                <w:shd w:val="clear" w:color="auto" w:fill="auto"/>
                 <w:rFonts w:ascii="Consolas" w:eastAsia="Malgun Gothic" w:hAnsi="Consolas" w:cs="Consolas"/>
               </w:rPr>
               <w:t>fcbf091</w:t>
@@ -31492,7 +31366,7 @@
               <w:rPr>
                 <w:sz w:val="18"/>
                 <w:szCs w:val="18"/>
-                <w:shd w:val="clear"/>
+                <w:shd w:val="clear" w:color="auto" w:fill="auto"/>
               </w:rPr>
               <w:t xml:space="preserve">, </w:t>
             </w:r>
@@ -31500,7 +31374,7 @@
               <w:rPr>
                 <w:sz w:val="18"/>
                 <w:szCs w:val="18"/>
-                <w:shd w:val="clear"/>
+                <w:shd w:val="clear" w:color="auto" w:fill="auto"/>
                 <w:rFonts w:ascii="Consolas" w:eastAsia="Malgun Gothic" w:hAnsi="Consolas" w:cs="Consolas"/>
               </w:rPr>
               <w:t>6f82886</w:t>
@@ -31536,7 +31410,7 @@
               <w:rPr>
                 <w:sz w:val="18"/>
                 <w:szCs w:val="18"/>
-                <w:shd w:val="clear"/>
+                <w:shd w:val="clear" w:color="auto" w:fill="auto"/>
               </w:rPr>
               <w:t>14</w:t>
             </w:r>
@@ -31577,7 +31451,7 @@
               <w:rPr>
                 <w:sz w:val="18"/>
                 <w:szCs w:val="18"/>
-                <w:shd w:val="clear"/>
+                <w:shd w:val="clear" w:color="auto" w:fill="auto"/>
               </w:rPr>
               <w:t>시험</w:t>
             </w:r>
@@ -31612,7 +31486,7 @@
               <w:rPr>
                 <w:sz w:val="18"/>
                 <w:szCs w:val="18"/>
-                <w:shd w:val="clear"/>
+                <w:shd w:val="clear" w:color="auto" w:fill="auto"/>
               </w:rPr>
               <w:t xml:space="preserve">상태머신 단위 테스트, 온라인 KPI 집계 스크립트</w:t>
             </w:r>
@@ -31647,7 +31521,7 @@
               <w:rPr>
                 <w:sz w:val="18"/>
                 <w:szCs w:val="18"/>
-                <w:shd w:val="clear"/>
+                <w:shd w:val="clear" w:color="auto" w:fill="auto"/>
                 <w:rFonts w:ascii="Consolas" w:eastAsia="Malgun Gothic" w:hAnsi="Consolas" w:cs="Consolas"/>
               </w:rPr>
               <w:t>fcbf091</w:t>
@@ -31656,7 +31530,7 @@
               <w:rPr>
                 <w:sz w:val="18"/>
                 <w:szCs w:val="18"/>
-                <w:shd w:val="clear"/>
+                <w:shd w:val="clear" w:color="auto" w:fill="auto"/>
               </w:rPr>
               <w:t xml:space="preserve">, </w:t>
             </w:r>
@@ -31664,7 +31538,7 @@
               <w:rPr>
                 <w:sz w:val="18"/>
                 <w:szCs w:val="18"/>
-                <w:shd w:val="clear"/>
+                <w:shd w:val="clear" w:color="auto" w:fill="auto"/>
                 <w:rFonts w:ascii="Consolas" w:eastAsia="Malgun Gothic" w:hAnsi="Consolas" w:cs="Consolas"/>
               </w:rPr>
               <w:t>1f1be74</w:t>
@@ -31700,7 +31574,7 @@
               <w:rPr>
                 <w:sz w:val="18"/>
                 <w:szCs w:val="18"/>
-                <w:shd w:val="clear"/>
+                <w:shd w:val="clear" w:color="auto" w:fill="auto"/>
               </w:rPr>
               <w:t xml:space="preserve">14 §6, 16 §5.8</w:t>
             </w:r>
@@ -31741,7 +31615,7 @@
               <w:rPr>
                 <w:sz w:val="18"/>
                 <w:szCs w:val="18"/>
-                <w:shd w:val="clear"/>
+                <w:shd w:val="clear" w:color="auto" w:fill="auto"/>
               </w:rPr>
               <w:t>문서/발표</w:t>
             </w:r>
@@ -31776,7 +31650,7 @@
               <w:rPr>
                 <w:sz w:val="18"/>
                 <w:szCs w:val="18"/>
-                <w:shd w:val="clear"/>
+                <w:shd w:val="clear" w:color="auto" w:fill="auto"/>
               </w:rPr>
               <w:t xml:space="preserve">14 web 구현보고서 v2.0, 09 화면목록, 캡처 19장</w:t>
             </w:r>
@@ -31811,7 +31685,7 @@
               <w:rPr>
                 <w:sz w:val="18"/>
                 <w:szCs w:val="18"/>
-                <w:shd w:val="clear"/>
+                <w:shd w:val="clear" w:color="auto" w:fill="auto"/>
                 <w:rFonts w:ascii="Consolas" w:eastAsia="Malgun Gothic" w:hAnsi="Consolas" w:cs="Consolas"/>
               </w:rPr>
               <w:t>63145b4</w:t>
@@ -31820,7 +31694,7 @@
               <w:rPr>
                 <w:sz w:val="18"/>
                 <w:szCs w:val="18"/>
-                <w:shd w:val="clear"/>
+                <w:shd w:val="clear" w:color="auto" w:fill="auto"/>
               </w:rPr>
               <w:t xml:space="preserve">, </w:t>
             </w:r>
@@ -31828,7 +31702,7 @@
               <w:rPr>
                 <w:sz w:val="18"/>
                 <w:szCs w:val="18"/>
-                <w:shd w:val="clear"/>
+                <w:shd w:val="clear" w:color="auto" w:fill="auto"/>
                 <w:rFonts w:ascii="Consolas" w:eastAsia="Malgun Gothic" w:hAnsi="Consolas" w:cs="Consolas"/>
               </w:rPr>
               <w:t>5145090</w:t>
@@ -31864,7 +31738,7 @@
               <w:rPr>
                 <w:sz w:val="18"/>
                 <w:szCs w:val="18"/>
-                <w:shd w:val="clear"/>
+                <w:shd w:val="clear" w:color="auto" w:fill="auto"/>
               </w:rPr>
               <w:t xml:space="preserve">09, 14, 21</w:t>
             </w:r>
@@ -31876,7 +31750,7 @@
       <w:pPr>
         <w:spacing w:lineRule="exact" w:line="120" w:after="0"/>
         <w:rPr>
-          <w:shd w:val="clear"/>
+          <w:shd w:val="clear" w:color="auto" w:fill="auto"/>
         </w:rPr>
       </w:pPr>
     </w:p>
@@ -31886,35 +31760,21 @@
         <w:spacing w:before="0" w:after="160"/>
         <w:pageBreakBefore w:val="1"/>
         <w:rPr>
-          <w:shd w:val="clear"/>
+          <w:shd w:val="clear" w:color="auto" w:fill="auto"/>
         </w:rPr>
       </w:pPr>
       <w:r>
         <w:rPr>
-          <w:shd w:val="clear"/>
+          <w:shd w:val="clear" w:color="auto" w:fill="auto"/>
         </w:rPr>
         <w:t xml:space="preserve">별첨 4. 개인 역할 기술서</w:t>
       </w:r>
       <w:r>
         <w:rPr>
-          <w:shd w:val="clear"/>
+          <w:shd w:val="clear" w:color="auto" w:fill="auto"/>
           <w:lang w:eastAsia="ko-KR"/>
         </w:rPr>
-        <w:t xml:space="preserve"> </w:t>
-      </w:r>
-      <w:r>
-        <w:rPr>
-          <w:shd w:val="clear"/>
-          <w:lang w:eastAsia="ko-KR"/>
-        </w:rPr>
-        <w:t xml:space="preserve">- 김지</w:t>
-      </w:r>
-      <w:r>
-        <w:rPr>
-          <w:shd w:val="clear"/>
-          <w:lang w:eastAsia="ko-KR"/>
-        </w:rPr>
-        <w:t>훈</w:t>
+        <w:t xml:space="preserve"> - 김지훈</w:t>
       </w:r>
     </w:p>
     <w:tbl>
@@ -31980,7 +31840,7 @@
                 <w:b w:val="1"/>
                 <w:sz w:val="18"/>
                 <w:szCs w:val="18"/>
-                <w:shd w:val="clear"/>
+                <w:shd w:val="clear" w:color="auto" w:fill="auto"/>
               </w:rPr>
               <w:t>이름</w:t>
             </w:r>
@@ -32015,7 +31875,7 @@
               <w:rPr>
                 <w:sz w:val="18"/>
                 <w:szCs w:val="18"/>
-                <w:shd w:val="clear"/>
+                <w:shd w:val="clear" w:color="auto" w:fill="auto"/>
               </w:rPr>
               <w:t>김지훈</w:t>
             </w:r>
@@ -32052,7 +31912,7 @@
                 <w:b w:val="1"/>
                 <w:sz w:val="18"/>
                 <w:szCs w:val="18"/>
-                <w:shd w:val="clear"/>
+                <w:shd w:val="clear" w:color="auto" w:fill="auto"/>
               </w:rPr>
               <w:t>팀</w:t>
             </w:r>
@@ -32087,7 +31947,7 @@
               <w:rPr>
                 <w:sz w:val="18"/>
                 <w:szCs w:val="18"/>
-                <w:shd w:val="clear"/>
+                <w:shd w:val="clear" w:color="auto" w:fill="auto"/>
               </w:rPr>
               <w:t>심기일전</w:t>
             </w:r>
@@ -32130,7 +31990,7 @@
                 <w:b w:val="1"/>
                 <w:sz w:val="18"/>
                 <w:szCs w:val="18"/>
-                <w:shd w:val="clear"/>
+                <w:shd w:val="clear" w:color="auto" w:fill="auto"/>
               </w:rPr>
               <w:t xml:space="preserve">담당 역할</w:t>
             </w:r>
@@ -32165,7 +32025,7 @@
               <w:rPr>
                 <w:sz w:val="18"/>
                 <w:szCs w:val="18"/>
-                <w:shd w:val="clear"/>
+                <w:shd w:val="clear" w:color="auto" w:fill="auto"/>
               </w:rPr>
               <w:t xml:space="preserve">데이터 수집 R · 요구사항·범위 R · 보고·최종 제출 R</w:t>
             </w:r>
@@ -32202,7 +32062,7 @@
                 <w:b w:val="1"/>
                 <w:sz w:val="18"/>
                 <w:szCs w:val="18"/>
-                <w:shd w:val="clear"/>
+                <w:shd w:val="clear" w:color="auto" w:fill="auto"/>
               </w:rPr>
               <w:t>프로젝트</w:t>
             </w:r>
@@ -32237,7 +32097,7 @@
               <w:rPr>
                 <w:sz w:val="18"/>
                 <w:szCs w:val="18"/>
-                <w:shd w:val="clear"/>
+                <w:shd w:val="clear" w:color="auto" w:fill="auto"/>
               </w:rPr>
               <w:t xml:space="preserve">SafeSign PhysicalAI</w:t>
             </w:r>
@@ -32280,7 +32140,7 @@
                 <w:b w:val="1"/>
                 <w:sz w:val="18"/>
                 <w:szCs w:val="18"/>
-                <w:shd w:val="clear"/>
+                <w:shd w:val="clear" w:color="auto" w:fill="auto"/>
               </w:rPr>
               <w:t>수행기간</w:t>
             </w:r>
@@ -32315,7 +32175,7 @@
               <w:rPr>
                 <w:sz w:val="18"/>
                 <w:szCs w:val="18"/>
-                <w:shd w:val="clear"/>
+                <w:shd w:val="clear" w:color="auto" w:fill="auto"/>
               </w:rPr>
               <w:t xml:space="preserve">2026-09-04 ~ 10-12 (W1~W5)</w:t>
             </w:r>
@@ -32352,7 +32212,7 @@
                 <w:b w:val="1"/>
                 <w:sz w:val="18"/>
                 <w:szCs w:val="18"/>
-                <w:shd w:val="clear"/>
+                <w:shd w:val="clear" w:color="auto" w:fill="auto"/>
               </w:rPr>
               <w:t>작성일</w:t>
             </w:r>
@@ -32387,7 +32247,7 @@
               <w:rPr>
                 <w:sz w:val="18"/>
                 <w:szCs w:val="18"/>
-                <w:shd w:val="clear"/>
+                <w:shd w:val="clear" w:color="auto" w:fill="auto"/>
               </w:rPr>
               <w:t>2026-10-06</w:t>
             </w:r>
@@ -32399,7 +32259,7 @@
       <w:pPr>
         <w:spacing w:lineRule="exact" w:line="120" w:after="0"/>
         <w:rPr>
-          <w:shd w:val="clear"/>
+          <w:shd w:val="clear" w:color="auto" w:fill="auto"/>
         </w:rPr>
       </w:pPr>
     </w:p>
@@ -32408,12 +32268,12 @@
         <w:pStyle w:val="PO163"/>
         <w:spacing w:before="90" w:after="20"/>
         <w:rPr>
-          <w:shd w:val="clear"/>
+          <w:shd w:val="clear" w:color="auto" w:fill="auto"/>
         </w:rPr>
       </w:pPr>
       <w:r>
         <w:rPr>
-          <w:shd w:val="clear"/>
+          <w:shd w:val="clear" w:color="auto" w:fill="auto"/>
         </w:rPr>
         <w:t xml:space="preserve">책임 요약</w:t>
       </w:r>
@@ -32422,7 +32282,7 @@
       <w:pPr>
         <w:spacing w:lineRule="auto" w:line="240" w:after="30"/>
         <w:rPr>
-          <w:shd w:val="clear"/>
+          <w:shd w:val="clear" w:color="auto" w:fill="auto"/>
         </w:rPr>
       </w:pPr>
       <w:r>
@@ -32430,7 +32290,7 @@
           <w:b w:val="1"/>
           <w:sz w:val="18"/>
           <w:szCs w:val="18"/>
-          <w:shd w:val="clear"/>
+          <w:shd w:val="clear" w:color="auto" w:fill="auto"/>
         </w:rPr>
         <w:t xml:space="preserve">학습 데이터 전부(공개 데이터 27,735건)를 확보·변환했고, 결과보고서와 제출 서류를 정리했다.</w:t>
       </w:r>
@@ -32444,14 +32304,14 @@
         </w:numPr>
         <w:spacing w:lineRule="auto" w:line="240" w:after="0"/>
         <w:rPr>
-          <w:shd w:val="clear"/>
+          <w:shd w:val="clear" w:color="auto" w:fill="auto"/>
         </w:rPr>
       </w:pPr>
       <w:r>
         <w:rPr>
           <w:sz w:val="18"/>
           <w:szCs w:val="18"/>
-          <w:shd w:val="clear"/>
+          <w:shd w:val="clear" w:color="auto" w:fill="auto"/>
         </w:rPr>
         <w:t xml:space="preserve">범위: 공개 데이터셋 검토·라이선스·변환, 사용자 시나리오·역할분담표, 결과보고서, 제출용 Word 5개</w:t>
       </w:r>
@@ -32465,14 +32325,14 @@
         </w:numPr>
         <w:spacing w:lineRule="auto" w:line="240" w:after="0"/>
         <w:rPr>
-          <w:shd w:val="clear"/>
+          <w:shd w:val="clear" w:color="auto" w:fill="auto"/>
         </w:rPr>
       </w:pPr>
       <w:r>
         <w:rPr>
           <w:sz w:val="18"/>
           <w:szCs w:val="18"/>
-          <w:shd w:val="clear"/>
+          <w:shd w:val="clear" w:color="auto" w:fill="auto"/>
         </w:rPr>
         <w:t xml:space="preserve">협업 경계: 학습·판정은 이동혁, 화면은 조은수·이동혁. 비전공이라 Claude와 팀원 설명을 받아 작업</w:t>
       </w:r>
@@ -32482,12 +32342,12 @@
         <w:pStyle w:val="PO163"/>
         <w:spacing w:before="90" w:after="20"/>
         <w:rPr>
-          <w:shd w:val="clear"/>
+          <w:shd w:val="clear" w:color="auto" w:fill="auto"/>
         </w:rPr>
       </w:pPr>
       <w:r>
         <w:rPr>
-          <w:shd w:val="clear"/>
+          <w:shd w:val="clear" w:color="auto" w:fill="auto"/>
         </w:rPr>
         <w:t xml:space="preserve">Situation / Task</w:t>
       </w:r>
@@ -32496,7 +32356,7 @@
       <w:pPr>
         <w:spacing w:lineRule="auto" w:line="240" w:after="30"/>
         <w:rPr>
-          <w:shd w:val="clear"/>
+          <w:shd w:val="clear" w:color="auto" w:fill="auto"/>
         </w:rPr>
       </w:pPr>
       <w:r>
@@ -32504,7 +32364,7 @@
           <w:b w:val="1"/>
           <w:sz w:val="18"/>
           <w:szCs w:val="18"/>
-          <w:shd w:val="clear"/>
+          <w:shd w:val="clear" w:color="auto" w:fill="auto"/>
         </w:rPr>
         <w:t xml:space="preserve">우리 수신호를 담은 공개 데이터가 없는 상태에서, 추석 연휴 전까지 7종 학습 데이터를 모아야 했다.</w:t>
       </w:r>
@@ -32518,14 +32378,14 @@
         </w:numPr>
         <w:spacing w:lineRule="auto" w:line="240" w:after="0"/>
         <w:rPr>
-          <w:shd w:val="clear"/>
+          <w:shd w:val="clear" w:color="auto" w:fill="auto"/>
         </w:rPr>
       </w:pPr>
       <w:r>
         <w:rPr>
           <w:sz w:val="18"/>
           <w:szCs w:val="18"/>
-          <w:shd w:val="clear"/>
+          <w:shd w:val="clear" w:color="auto" w:fill="auto"/>
         </w:rPr>
         <w:t xml:space="preserve">제약: 7종 × 약 300장을 직접 찍기엔 시간·인력 부족, 공개 데이터 2종이 동일조건공유 라이선스</w:t>
       </w:r>
@@ -32539,14 +32399,14 @@
         </w:numPr>
         <w:spacing w:lineRule="auto" w:line="240" w:after="0"/>
         <w:rPr>
-          <w:shd w:val="clear"/>
+          <w:shd w:val="clear" w:color="auto" w:fill="auto"/>
         </w:rPr>
       </w:pPr>
       <w:r>
         <w:rPr>
           <w:sz w:val="18"/>
           <w:szCs w:val="18"/>
-          <w:shd w:val="clear"/>
+          <w:shd w:val="clear" w:color="auto" w:fill="auto"/>
         </w:rPr>
         <w:t xml:space="preserve">목표: 7종 각 300장 이상, vision 정규화를 그대로 통과하는 형식, 원본 미배포, 결과보고서 수치의 원본 일치</w:t>
       </w:r>
@@ -32556,12 +32416,12 @@
         <w:pStyle w:val="PO163"/>
         <w:spacing w:before="90" w:after="20"/>
         <w:rPr>
-          <w:shd w:val="clear"/>
+          <w:shd w:val="clear" w:color="auto" w:fill="auto"/>
         </w:rPr>
       </w:pPr>
       <w:r>
         <w:rPr>
-          <w:shd w:val="clear"/>
+          <w:shd w:val="clear" w:color="auto" w:fill="auto"/>
         </w:rPr>
         <w:t>Action</w:t>
       </w:r>
@@ -32570,7 +32430,7 @@
       <w:pPr>
         <w:spacing w:lineRule="auto" w:line="240" w:after="30"/>
         <w:rPr>
-          <w:shd w:val="clear"/>
+          <w:shd w:val="clear" w:color="auto" w:fill="auto"/>
         </w:rPr>
       </w:pPr>
       <w:r>
@@ -32578,7 +32438,7 @@
           <w:b w:val="1"/>
           <w:sz w:val="18"/>
           <w:szCs w:val="18"/>
-          <w:shd w:val="clear"/>
+          <w:shd w:val="clear" w:color="auto" w:fill="auto"/>
         </w:rPr>
         <w:t xml:space="preserve">직접 촬영 대신 공개 데이터에서 손 모양만 빌리기로 하고, 쓸 수 있는지부터 쟀다.</w:t>
       </w:r>
@@ -32592,14 +32452,14 @@
         </w:numPr>
         <w:spacing w:lineRule="auto" w:line="240" w:after="0"/>
         <w:rPr>
-          <w:shd w:val="clear"/>
+          <w:shd w:val="clear" w:color="auto" w:fill="auto"/>
         </w:rPr>
       </w:pPr>
       <w:r>
         <w:rPr>
           <w:sz w:val="18"/>
           <w:szCs w:val="18"/>
-          <w:shd w:val="clear"/>
+          <w:shd w:val="clear" w:color="auto" w:fill="auto"/>
         </w:rPr>
         <w:t xml:space="preserve">분석·선택: 클래스별 손 검출률을 먼저 재는 절차를 만들고, 손 모양 2종 변경안을 내 팀 승인을 받았다</w:t>
       </w:r>
@@ -32613,14 +32473,14 @@
         </w:numPr>
         <w:spacing w:lineRule="auto" w:line="240" w:after="0"/>
         <w:rPr>
-          <w:shd w:val="clear"/>
+          <w:shd w:val="clear" w:color="auto" w:fill="auto"/>
         </w:rPr>
       </w:pPr>
       <w:r>
         <w:rPr>
           <w:sz w:val="18"/>
           <w:szCs w:val="18"/>
-          <w:shd w:val="clear"/>
+          <w:shd w:val="clear" w:color="auto" w:fill="auto"/>
         </w:rPr>
         <w:t xml:space="preserve">구현·시험: 27,735건 변환(정규화 통과 실패 0건), 원본은 git에서 제외, DB 결과 필드·회귀 테스트 2건</w:t>
       </w:r>
@@ -32634,14 +32494,14 @@
         </w:numPr>
         <w:spacing w:lineRule="auto" w:line="240" w:after="0"/>
         <w:rPr>
-          <w:shd w:val="clear"/>
+          <w:shd w:val="clear" w:color="auto" w:fill="auto"/>
         </w:rPr>
       </w:pPr>
       <w:r>
         <w:rPr>
           <w:sz w:val="18"/>
           <w:szCs w:val="18"/>
-          <w:shd w:val="clear"/>
+          <w:shd w:val="clear" w:color="auto" w:fill="auto"/>
         </w:rPr>
         <w:t xml:space="preserve">협업: 잠정 KPI 촬영(JH, 본인)과 09-29 최종 촬영에 참여하고, 사용자 시나리오를 팀 의견에 맞춰 계속 고쳤다</w:t>
       </w:r>
@@ -32651,12 +32511,12 @@
         <w:pStyle w:val="PO163"/>
         <w:spacing w:before="90" w:after="20"/>
         <w:rPr>
-          <w:shd w:val="clear"/>
+          <w:shd w:val="clear" w:color="auto" w:fill="auto"/>
         </w:rPr>
       </w:pPr>
       <w:r>
         <w:rPr>
-          <w:shd w:val="clear"/>
+          <w:shd w:val="clear" w:color="auto" w:fill="auto"/>
         </w:rPr>
         <w:t>Result</w:t>
       </w:r>
@@ -32665,7 +32525,7 @@
       <w:pPr>
         <w:spacing w:lineRule="auto" w:line="240" w:after="30"/>
         <w:rPr>
-          <w:shd w:val="clear"/>
+          <w:shd w:val="clear" w:color="auto" w:fill="auto"/>
         </w:rPr>
       </w:pPr>
       <w:r>
@@ -32673,7 +32533,7 @@
           <w:b w:val="1"/>
           <w:sz w:val="18"/>
           <w:szCs w:val="18"/>
-          <w:shd w:val="clear"/>
+          <w:shd w:val="clear" w:color="auto" w:fill="auto"/>
         </w:rPr>
         <w:t xml:space="preserve">이 27,735건이 운영 모델 학습 데이터의 전부이고, 그 모델이 팀원 210시도에서 정답률 95.2%를 냈다.</w:t>
       </w:r>
@@ -32687,14 +32547,14 @@
         </w:numPr>
         <w:spacing w:lineRule="auto" w:line="240" w:after="0"/>
         <w:rPr>
-          <w:shd w:val="clear"/>
+          <w:shd w:val="clear" w:color="auto" w:fill="auto"/>
         </w:rPr>
       </w:pPr>
       <w:r>
         <w:rPr>
           <w:sz w:val="18"/>
           <w:szCs w:val="18"/>
-          <w:shd w:val="clear"/>
+          <w:shd w:val="clear" w:color="auto" w:fill="auto"/>
         </w:rPr>
         <w:t xml:space="preserve">7종 모두 300장 기준 충족(검출률 84.6%), 마일스톤 "09-20 데이터 수집 완료"와 같은 날 확보</w:t>
       </w:r>
@@ -32708,14 +32568,14 @@
         </w:numPr>
         <w:spacing w:lineRule="auto" w:line="240" w:after="0"/>
         <w:rPr>
-          <w:shd w:val="clear"/>
+          <w:shd w:val="clear" w:color="auto" w:fill="auto"/>
         </w:rPr>
       </w:pPr>
       <w:r>
         <w:rPr>
           <w:sz w:val="18"/>
           <w:szCs w:val="18"/>
-          <w:shd w:val="clear"/>
+          <w:shd w:val="clear" w:color="auto" w:fill="auto"/>
         </w:rPr>
         <w:t xml:space="preserve">결과보고서 수치를 원본과 대조해 맞췄고(md·docx 새 차이 0건), 제출용 Word 5개를 누락 없이 변환</w:t>
       </w:r>
@@ -32725,12 +32585,12 @@
         <w:pStyle w:val="PO163"/>
         <w:spacing w:before="90" w:after="20"/>
         <w:rPr>
-          <w:shd w:val="clear"/>
+          <w:shd w:val="clear" w:color="auto" w:fill="auto"/>
         </w:rPr>
       </w:pPr>
       <w:r>
         <w:rPr>
-          <w:shd w:val="clear"/>
+          <w:shd w:val="clear" w:color="auto" w:fill="auto"/>
         </w:rPr>
         <w:t xml:space="preserve">Issue &amp; Learning</w:t>
       </w:r>
@@ -32739,7 +32599,7 @@
       <w:pPr>
         <w:spacing w:lineRule="auto" w:line="240" w:after="30"/>
         <w:rPr>
-          <w:shd w:val="clear"/>
+          <w:shd w:val="clear" w:color="auto" w:fill="auto"/>
         </w:rPr>
       </w:pPr>
       <w:r>
@@ -32747,7 +32607,7 @@
           <w:b w:val="1"/>
           <w:sz w:val="18"/>
           <w:szCs w:val="18"/>
-          <w:shd w:val="clear"/>
+          <w:shd w:val="clear" w:color="auto" w:fill="auto"/>
         </w:rPr>
         <w:t xml:space="preserve">변환 직후 적은 정답률 97.7%는 복사본·연속 촬영이 학습과 시험에 함께 들어가 부풀려진 값이었다.</w:t>
       </w:r>
@@ -32761,14 +32621,14 @@
         </w:numPr>
         <w:spacing w:lineRule="auto" w:line="240" w:after="0"/>
         <w:rPr>
-          <w:shd w:val="clear"/>
+          <w:shd w:val="clear" w:color="auto" w:fill="auto"/>
         </w:rPr>
       </w:pPr>
       <w:r>
         <w:rPr>
           <w:sz w:val="18"/>
           <w:szCs w:val="18"/>
-          <w:shd w:val="clear"/>
+          <w:shd w:val="clear" w:color="auto" w:fill="auto"/>
         </w:rPr>
         <w:t xml:space="preserve">조치: 누수는 vision 담당이 찾아 세션 단위 분할로 고정했고(77.57%), 공개 데이터 점수는 KPI 근거에서 빠졌다</w:t>
       </w:r>
@@ -32782,14 +32642,14 @@
         </w:numPr>
         <w:spacing w:lineRule="auto" w:line="240" w:after="0"/>
         <w:rPr>
-          <w:shd w:val="clear"/>
+          <w:shd w:val="clear" w:color="auto" w:fill="auto"/>
         </w:rPr>
       </w:pPr>
       <w:r>
         <w:rPr>
           <w:sz w:val="18"/>
           <w:szCs w:val="18"/>
-          <w:shd w:val="clear"/>
+          <w:shd w:val="clear" w:color="auto" w:fill="auto"/>
         </w:rPr>
         <w:t xml:space="preserve">다음에는: 데이터를 받으면 중복·세션 묶음부터 세고, 형식 검사 테스트를 먼저 만든다</w:t>
       </w:r>
@@ -32799,12 +32659,12 @@
         <w:pStyle w:val="PO163"/>
         <w:spacing w:before="90" w:after="20"/>
         <w:rPr>
-          <w:shd w:val="clear"/>
+          <w:shd w:val="clear" w:color="auto" w:fill="auto"/>
         </w:rPr>
       </w:pPr>
       <w:r>
         <w:rPr>
-          <w:shd w:val="clear"/>
+          <w:shd w:val="clear" w:color="auto" w:fill="auto"/>
         </w:rPr>
         <w:t xml:space="preserve">산출물 및 증거</w:t>
       </w:r>
@@ -32872,7 +32732,7 @@
                 <w:b w:val="1"/>
                 <w:sz w:val="18"/>
                 <w:szCs w:val="18"/>
-                <w:shd w:val="clear"/>
+                <w:shd w:val="clear" w:color="auto" w:fill="auto"/>
               </w:rPr>
               <w:t>구분</w:t>
             </w:r>
@@ -32909,7 +32769,7 @@
                 <w:b w:val="1"/>
                 <w:sz w:val="18"/>
                 <w:szCs w:val="18"/>
-                <w:shd w:val="clear"/>
+                <w:shd w:val="clear" w:color="auto" w:fill="auto"/>
               </w:rPr>
               <w:t>산출물/기여</w:t>
             </w:r>
@@ -32946,7 +32806,7 @@
                 <w:b w:val="1"/>
                 <w:sz w:val="18"/>
                 <w:szCs w:val="18"/>
-                <w:shd w:val="clear"/>
+                <w:shd w:val="clear" w:color="auto" w:fill="auto"/>
               </w:rPr>
               <w:t xml:space="preserve">근거 링크</w:t>
             </w:r>
@@ -32983,7 +32843,7 @@
                 <w:b w:val="1"/>
                 <w:sz w:val="18"/>
                 <w:szCs w:val="18"/>
-                <w:shd w:val="clear"/>
+                <w:shd w:val="clear" w:color="auto" w:fill="auto"/>
               </w:rPr>
               <w:t xml:space="preserve">관련 문서</w:t>
             </w:r>
@@ -33024,7 +32884,7 @@
               <w:rPr>
                 <w:sz w:val="18"/>
                 <w:szCs w:val="18"/>
-                <w:shd w:val="clear"/>
+                <w:shd w:val="clear" w:color="auto" w:fill="auto"/>
               </w:rPr>
               <w:t>기획</w:t>
             </w:r>
@@ -33059,7 +32919,7 @@
               <w:rPr>
                 <w:sz w:val="18"/>
                 <w:szCs w:val="18"/>
-                <w:shd w:val="clear"/>
+                <w:shd w:val="clear" w:color="auto" w:fill="auto"/>
               </w:rPr>
               <w:t xml:space="preserve">사용자 시나리오, 역할분담표, 손 모양 2종 변경 제안</w:t>
             </w:r>
@@ -33094,7 +32954,7 @@
               <w:rPr>
                 <w:sz w:val="18"/>
                 <w:szCs w:val="18"/>
-                <w:shd w:val="clear"/>
+                <w:shd w:val="clear" w:color="auto" w:fill="auto"/>
                 <w:rFonts w:ascii="Consolas" w:eastAsia="Malgun Gothic" w:hAnsi="Consolas" w:cs="Consolas"/>
               </w:rPr>
               <w:t>bf51609</w:t>
@@ -33130,7 +32990,7 @@
               <w:rPr>
                 <w:sz w:val="18"/>
                 <w:szCs w:val="18"/>
-                <w:shd w:val="clear"/>
+                <w:shd w:val="clear" w:color="auto" w:fill="auto"/>
               </w:rPr>
               <w:t xml:space="preserve">00, 01, 02 §4</w:t>
             </w:r>
@@ -33171,7 +33031,7 @@
               <w:rPr>
                 <w:sz w:val="18"/>
                 <w:szCs w:val="18"/>
-                <w:shd w:val="clear"/>
+                <w:shd w:val="clear" w:color="auto" w:fill="auto"/>
               </w:rPr>
               <w:t>구현</w:t>
             </w:r>
@@ -33206,7 +33066,7 @@
               <w:rPr>
                 <w:sz w:val="18"/>
                 <w:szCs w:val="18"/>
-                <w:shd w:val="clear"/>
+                <w:shd w:val="clear" w:color="auto" w:fill="auto"/>
               </w:rPr>
               <w:t xml:space="preserve">사진 → 랜드마크 변환 27,735건, 회원 DB 결과 필드</w:t>
             </w:r>
@@ -33241,7 +33101,7 @@
               <w:rPr>
                 <w:sz w:val="18"/>
                 <w:szCs w:val="18"/>
-                <w:shd w:val="clear"/>
+                <w:shd w:val="clear" w:color="auto" w:fill="auto"/>
                 <w:rFonts w:ascii="Consolas" w:eastAsia="Malgun Gothic" w:hAnsi="Consolas" w:cs="Consolas"/>
               </w:rPr>
               <w:t>bf51609</w:t>
@@ -33250,7 +33110,7 @@
               <w:rPr>
                 <w:sz w:val="18"/>
                 <w:szCs w:val="18"/>
-                <w:shd w:val="clear"/>
+                <w:shd w:val="clear" w:color="auto" w:fill="auto"/>
               </w:rPr>
               <w:t xml:space="preserve">, </w:t>
             </w:r>
@@ -33258,7 +33118,7 @@
               <w:rPr>
                 <w:sz w:val="18"/>
                 <w:szCs w:val="18"/>
-                <w:shd w:val="clear"/>
+                <w:shd w:val="clear" w:color="auto" w:fill="auto"/>
                 <w:rFonts w:ascii="Consolas" w:eastAsia="Malgun Gothic" w:hAnsi="Consolas" w:cs="Consolas"/>
               </w:rPr>
               <w:t>1fc35c5</w:t>
@@ -33294,7 +33154,7 @@
               <w:rPr>
                 <w:sz w:val="18"/>
                 <w:szCs w:val="18"/>
-                <w:shd w:val="clear"/>
+                <w:shd w:val="clear" w:color="auto" w:fill="auto"/>
               </w:rPr>
               <w:t xml:space="preserve">04, 18</w:t>
             </w:r>
@@ -33335,7 +33195,7 @@
               <w:rPr>
                 <w:sz w:val="18"/>
                 <w:szCs w:val="18"/>
-                <w:shd w:val="clear"/>
+                <w:shd w:val="clear" w:color="auto" w:fill="auto"/>
               </w:rPr>
               <w:t>시험</w:t>
             </w:r>
@@ -33370,7 +33230,7 @@
               <w:rPr>
                 <w:sz w:val="18"/>
                 <w:szCs w:val="18"/>
-                <w:shd w:val="clear"/>
+                <w:shd w:val="clear" w:color="auto" w:fill="auto"/>
               </w:rPr>
               <w:t xml:space="preserve">정규화 전량 통과, 자체 촬영 JH, 회귀 테스트 2건</w:t>
             </w:r>
@@ -33405,7 +33265,7 @@
               <w:rPr>
                 <w:sz w:val="18"/>
                 <w:szCs w:val="18"/>
-                <w:shd w:val="clear"/>
+                <w:shd w:val="clear" w:color="auto" w:fill="auto"/>
                 <w:rFonts w:ascii="Consolas" w:eastAsia="Malgun Gothic" w:hAnsi="Consolas" w:cs="Consolas"/>
               </w:rPr>
               <w:t>0dfe1a6</w:t>
@@ -33414,7 +33274,7 @@
               <w:rPr>
                 <w:sz w:val="18"/>
                 <w:szCs w:val="18"/>
-                <w:shd w:val="clear"/>
+                <w:shd w:val="clear" w:color="auto" w:fill="auto"/>
               </w:rPr>
               <w:t xml:space="preserve">, </w:t>
             </w:r>
@@ -33422,7 +33282,7 @@
               <w:rPr>
                 <w:sz w:val="18"/>
                 <w:szCs w:val="18"/>
-                <w:shd w:val="clear"/>
+                <w:shd w:val="clear" w:color="auto" w:fill="auto"/>
                 <w:rFonts w:ascii="Consolas" w:eastAsia="Malgun Gothic" w:hAnsi="Consolas" w:cs="Consolas"/>
               </w:rPr>
               <w:t>f13d24a</w:t>
@@ -33458,7 +33318,7 @@
               <w:rPr>
                 <w:sz w:val="18"/>
                 <w:szCs w:val="18"/>
-                <w:shd w:val="clear"/>
+                <w:shd w:val="clear" w:color="auto" w:fill="auto"/>
               </w:rPr>
               <w:t xml:space="preserve">04, 05</w:t>
             </w:r>
@@ -33499,7 +33359,7 @@
               <w:rPr>
                 <w:sz w:val="18"/>
                 <w:szCs w:val="18"/>
-                <w:shd w:val="clear"/>
+                <w:shd w:val="clear" w:color="auto" w:fill="auto"/>
               </w:rPr>
               <w:t>문서/발표</w:t>
             </w:r>
@@ -33534,7 +33394,7 @@
               <w:rPr>
                 <w:sz w:val="18"/>
                 <w:szCs w:val="18"/>
-                <w:shd w:val="clear"/>
+                <w:shd w:val="clear" w:color="auto" w:fill="auto"/>
               </w:rPr>
               <w:t xml:space="preserve">결과보고서 초안~v1.5, 제출용 Word 5개</w:t>
             </w:r>
@@ -33569,7 +33429,7 @@
               <w:rPr>
                 <w:sz w:val="18"/>
                 <w:szCs w:val="18"/>
-                <w:shd w:val="clear"/>
+                <w:shd w:val="clear" w:color="auto" w:fill="auto"/>
                 <w:rFonts w:ascii="Consolas" w:eastAsia="Malgun Gothic" w:hAnsi="Consolas" w:cs="Consolas"/>
               </w:rPr>
               <w:t>30165c4</w:t>
@@ -33578,7 +33438,7 @@
               <w:rPr>
                 <w:sz w:val="18"/>
                 <w:szCs w:val="18"/>
-                <w:shd w:val="clear"/>
+                <w:shd w:val="clear" w:color="auto" w:fill="auto"/>
               </w:rPr>
               <w:t xml:space="preserve">, </w:t>
             </w:r>
@@ -33586,7 +33446,7 @@
               <w:rPr>
                 <w:sz w:val="18"/>
                 <w:szCs w:val="18"/>
-                <w:shd w:val="clear"/>
+                <w:shd w:val="clear" w:color="auto" w:fill="auto"/>
                 <w:rFonts w:ascii="Consolas" w:eastAsia="Malgun Gothic" w:hAnsi="Consolas" w:cs="Consolas"/>
               </w:rPr>
               <w:t>4112993</w:t>
@@ -33622,7 +33482,7 @@
               <w:rPr>
                 <w:sz w:val="18"/>
                 <w:szCs w:val="18"/>
-                <w:shd w:val="clear"/>
+                <w:shd w:val="clear" w:color="auto" w:fill="auto"/>
               </w:rPr>
               <w:t>20</w:t>
             </w:r>
@@ -33634,7 +33494,7 @@
       <w:pPr>
         <w:spacing w:lineRule="exact" w:line="120" w:after="0"/>
         <w:rPr>
-          <w:shd w:val="clear"/>
+          <w:shd w:val="clear" w:color="auto" w:fill="auto"/>
         </w:rPr>
       </w:pPr>
     </w:p>
@@ -33684,7 +33544,7 @@
         <w:szCs w:val="16"/>
         <w:shd w:val="clear" w:color="auto" w:fill="auto"/>
       </w:rPr>
-      <w:t>1</w:t>
+      <w:t>13</w:t>
     </w:r>
     <w:r>
       <w:rPr>
@@ -34309,7 +34169,7 @@
       <w:rPr/>
     </w:pPr>
     <w:rPr>
-      <w:shd w:val="clear"/>
+      <w:shd w:val="clear" w:color="auto" w:fill="auto"/>
     </w:rPr>
     <w:tblPr>
       <w:tblBorders>
@@ -34338,7 +34198,7 @@
       <w:rPr/>
     </w:pPr>
     <w:rPr>
-      <w:shd w:val="clear"/>
+      <w:shd w:val="clear" w:color="auto" w:fill="auto"/>
     </w:rPr>
     <w:tblPr>
       <w:tblBorders>
@@ -34367,7 +34227,7 @@
       <w:rPr/>
     </w:pPr>
     <w:rPr>
-      <w:shd w:val="clear"/>
+      <w:shd w:val="clear" w:color="auto" w:fill="auto"/>
     </w:rPr>
     <w:tblPr>
       <w:tblBorders>
@@ -34437,7 +34297,7 @@
       <w:rPr/>
     </w:pPr>
     <w:rPr>
-      <w:shd w:val="clear"/>
+      <w:shd w:val="clear" w:color="auto" w:fill="auto"/>
     </w:rPr>
     <w:tblPr>
       <w:tblBorders>
@@ -34522,7 +34382,7 @@
       <w:rPr/>
     </w:pPr>
     <w:rPr>
-      <w:shd w:val="clear"/>
+      <w:shd w:val="clear" w:color="auto" w:fill="auto"/>
     </w:rPr>
     <w:tblPr>
       <w:tblCellMar>
@@ -34617,7 +34477,7 @@
       <w:rPr/>
     </w:pPr>
     <w:rPr>
-      <w:shd w:val="clear"/>
+      <w:shd w:val="clear" w:color="auto" w:fill="auto"/>
     </w:rPr>
     <w:tblPr>
       <w:tblCellMar>
@@ -34674,7 +34534,7 @@
       <w:rPr/>
     </w:pPr>
     <w:rPr>
-      <w:shd w:val="clear"/>
+      <w:shd w:val="clear" w:color="auto" w:fill="auto"/>
     </w:rPr>
     <w:tblPr>
       <w:tblCellMar>
@@ -34795,7 +34655,7 @@
       <w:rPr/>
     </w:pPr>
     <w:rPr>
-      <w:shd w:val="clear"/>
+      <w:shd w:val="clear" w:color="auto" w:fill="auto"/>
     </w:rPr>
     <w:tblPr>
       <w:tblBorders>
@@ -34860,7 +34720,7 @@
       <w:rPr/>
     </w:pPr>
     <w:rPr>
-      <w:shd w:val="clear"/>
+      <w:shd w:val="clear" w:color="auto" w:fill="auto"/>
     </w:rPr>
     <w:tblPr>
       <w:tblBorders>
@@ -34925,7 +34785,7 @@
       <w:rPr/>
     </w:pPr>
     <w:rPr>
-      <w:shd w:val="clear"/>
+      <w:shd w:val="clear" w:color="auto" w:fill="auto"/>
     </w:rPr>
     <w:tblPr>
       <w:tblBorders>
@@ -34990,7 +34850,7 @@
       <w:rPr/>
     </w:pPr>
     <w:rPr>
-      <w:shd w:val="clear"/>
+      <w:shd w:val="clear" w:color="auto" w:fill="auto"/>
     </w:rPr>
     <w:tblPr>
       <w:tblBorders>
@@ -35055,7 +34915,7 @@
       <w:rPr/>
     </w:pPr>
     <w:rPr>
-      <w:shd w:val="clear"/>
+      <w:shd w:val="clear" w:color="auto" w:fill="auto"/>
     </w:rPr>
     <w:tblPr>
       <w:tblBorders>
@@ -35120,7 +34980,7 @@
       <w:rPr/>
     </w:pPr>
     <w:rPr>
-      <w:shd w:val="clear"/>
+      <w:shd w:val="clear" w:color="auto" w:fill="auto"/>
     </w:rPr>
     <w:tblPr>
       <w:tblBorders>
@@ -35185,7 +35045,7 @@
       <w:rPr/>
     </w:pPr>
     <w:rPr>
-      <w:shd w:val="clear"/>
+      <w:shd w:val="clear" w:color="auto" w:fill="auto"/>
     </w:rPr>
     <w:tblPr>
       <w:tblBorders>
@@ -35250,7 +35110,7 @@
       <w:rPr/>
     </w:pPr>
     <w:rPr>
-      <w:shd w:val="clear"/>
+      <w:shd w:val="clear" w:color="auto" w:fill="auto"/>
     </w:rPr>
     <w:tblPr>
       <w:tblBorders>
@@ -35331,7 +35191,7 @@
       <w:rPr/>
     </w:pPr>
     <w:rPr>
-      <w:shd w:val="clear"/>
+      <w:shd w:val="clear" w:color="auto" w:fill="auto"/>
     </w:rPr>
     <w:tblPr>
       <w:tblBorders>
@@ -35412,7 +35272,7 @@
       <w:rPr/>
     </w:pPr>
     <w:rPr>
-      <w:shd w:val="clear"/>
+      <w:shd w:val="clear" w:color="auto" w:fill="auto"/>
     </w:rPr>
     <w:tblPr>
       <w:tblBorders>
@@ -35493,7 +35353,7 @@
       <w:rPr/>
     </w:pPr>
     <w:rPr>
-      <w:shd w:val="clear"/>
+      <w:shd w:val="clear" w:color="auto" w:fill="auto"/>
     </w:rPr>
     <w:tblPr>
       <w:tblBorders>
@@ -35574,7 +35434,7 @@
       <w:rPr/>
     </w:pPr>
     <w:rPr>
-      <w:shd w:val="clear"/>
+      <w:shd w:val="clear" w:color="auto" w:fill="auto"/>
     </w:rPr>
     <w:tblPr>
       <w:tblBorders>
@@ -35655,7 +35515,7 @@
       <w:rPr/>
     </w:pPr>
     <w:rPr>
-      <w:shd w:val="clear"/>
+      <w:shd w:val="clear" w:color="auto" w:fill="auto"/>
     </w:rPr>
     <w:tblPr>
       <w:tblBorders>
@@ -35736,7 +35596,7 @@
       <w:rPr/>
     </w:pPr>
     <w:rPr>
-      <w:shd w:val="clear"/>
+      <w:shd w:val="clear" w:color="auto" w:fill="auto"/>
     </w:rPr>
     <w:tblPr>
       <w:tblBorders>
@@ -35817,7 +35677,7 @@
       <w:rPr/>
     </w:pPr>
     <w:rPr>
-      <w:shd w:val="clear"/>
+      <w:shd w:val="clear" w:color="auto" w:fill="auto"/>
     </w:rPr>
     <w:tblPr>
       <w:tblBorders>
@@ -35954,7 +35814,7 @@
       <w:rPr/>
     </w:pPr>
     <w:rPr>
-      <w:shd w:val="clear"/>
+      <w:shd w:val="clear" w:color="auto" w:fill="auto"/>
     </w:rPr>
     <w:tblPr>
       <w:tblBorders>
@@ -36091,7 +35951,7 @@
       <w:rPr/>
     </w:pPr>
     <w:rPr>
-      <w:shd w:val="clear"/>
+      <w:shd w:val="clear" w:color="auto" w:fill="auto"/>
     </w:rPr>
     <w:tblPr>
       <w:tblBorders>
@@ -36228,7 +36088,7 @@
       <w:rPr/>
     </w:pPr>
     <w:rPr>
-      <w:shd w:val="clear"/>
+      <w:shd w:val="clear" w:color="auto" w:fill="auto"/>
     </w:rPr>
     <w:tblPr>
       <w:tblBorders>
@@ -36365,7 +36225,7 @@
       <w:rPr/>
     </w:pPr>
     <w:rPr>
-      <w:shd w:val="clear"/>
+      <w:shd w:val="clear" w:color="auto" w:fill="auto"/>
     </w:rPr>
     <w:tblPr>
       <w:tblBorders>
@@ -36502,7 +36362,7 @@
       <w:rPr/>
     </w:pPr>
     <w:rPr>
-      <w:shd w:val="clear"/>
+      <w:shd w:val="clear" w:color="auto" w:fill="auto"/>
     </w:rPr>
     <w:tblPr>
       <w:tblBorders>
@@ -36639,7 +36499,7 @@
       <w:rPr/>
     </w:pPr>
     <w:rPr>
-      <w:shd w:val="clear"/>
+      <w:shd w:val="clear" w:color="auto" w:fill="auto"/>
     </w:rPr>
     <w:tblPr>
       <w:tblBorders>
@@ -36776,7 +36636,7 @@
       <w:rPr/>
     </w:pPr>
     <w:rPr>
-      <w:shd w:val="clear"/>
+      <w:shd w:val="clear" w:color="auto" w:fill="auto"/>
     </w:rPr>
     <w:tblPr>
       <w:tblBorders>
@@ -36858,7 +36718,7 @@
       <w:rPr/>
     </w:pPr>
     <w:rPr>
-      <w:shd w:val="clear"/>
+      <w:shd w:val="clear" w:color="auto" w:fill="auto"/>
     </w:rPr>
     <w:tblPr>
       <w:tblBorders>
@@ -36940,7 +36800,7 @@
       <w:rPr/>
     </w:pPr>
     <w:rPr>
-      <w:shd w:val="clear"/>
+      <w:shd w:val="clear" w:color="auto" w:fill="auto"/>
     </w:rPr>
     <w:tblPr>
       <w:tblBorders>
@@ -37022,7 +36882,7 @@
       <w:rPr/>
     </w:pPr>
     <w:rPr>
-      <w:shd w:val="clear"/>
+      <w:shd w:val="clear" w:color="auto" w:fill="auto"/>
     </w:rPr>
     <w:tblPr>
       <w:tblBorders>
@@ -37104,7 +36964,7 @@
       <w:rPr/>
     </w:pPr>
     <w:rPr>
-      <w:shd w:val="clear"/>
+      <w:shd w:val="clear" w:color="auto" w:fill="auto"/>
     </w:rPr>
     <w:tblPr>
       <w:tblBorders>
@@ -37186,7 +37046,7 @@
       <w:rPr/>
     </w:pPr>
     <w:rPr>
-      <w:shd w:val="clear"/>
+      <w:shd w:val="clear" w:color="auto" w:fill="auto"/>
     </w:rPr>
     <w:tblPr>
       <w:tblBorders>
@@ -37268,7 +37128,7 @@
       <w:rPr/>
     </w:pPr>
     <w:rPr>
-      <w:shd w:val="clear"/>
+      <w:shd w:val="clear" w:color="auto" w:fill="auto"/>
     </w:rPr>
     <w:tblPr>
       <w:tblBorders>
@@ -37350,7 +37210,7 @@
       <w:rPr/>
     </w:pPr>
     <w:rPr>
-      <w:shd w:val="clear"/>
+      <w:shd w:val="clear" w:color="auto" w:fill="auto"/>
     </w:rPr>
     <w:tblPr>
       <w:tblBorders>
@@ -37460,7 +37320,7 @@
       <w:rPr/>
     </w:pPr>
     <w:rPr>
-      <w:shd w:val="clear"/>
+      <w:shd w:val="clear" w:color="auto" w:fill="auto"/>
     </w:rPr>
     <w:tblPr>
       <w:tblBorders>
@@ -37570,7 +37430,7 @@
       <w:rPr/>
     </w:pPr>
     <w:rPr>
-      <w:shd w:val="clear"/>
+      <w:shd w:val="clear" w:color="auto" w:fill="auto"/>
     </w:rPr>
     <w:tblPr>
       <w:tblBorders>
@@ -37680,7 +37540,7 @@
       <w:rPr/>
     </w:pPr>
     <w:rPr>
-      <w:shd w:val="clear"/>
+      <w:shd w:val="clear" w:color="auto" w:fill="auto"/>
     </w:rPr>
     <w:tblPr>
       <w:tblBorders>
@@ -37790,7 +37650,7 @@
       <w:rPr/>
     </w:pPr>
     <w:rPr>
-      <w:shd w:val="clear"/>
+      <w:shd w:val="clear" w:color="auto" w:fill="auto"/>
     </w:rPr>
     <w:tblPr>
       <w:tblBorders>
@@ -37900,7 +37760,7 @@
       <w:rPr/>
     </w:pPr>
     <w:rPr>
-      <w:shd w:val="clear"/>
+      <w:shd w:val="clear" w:color="auto" w:fill="auto"/>
     </w:rPr>
     <w:tblPr>
       <w:tblBorders>
@@ -38010,7 +37870,7 @@
       <w:rPr/>
     </w:pPr>
     <w:rPr>
-      <w:shd w:val="clear"/>
+      <w:shd w:val="clear" w:color="auto" w:fill="auto"/>
     </w:rPr>
     <w:tblPr>
       <w:tblBorders>
@@ -39618,7 +39478,7 @@
       <w:rPr/>
     </w:pPr>
     <w:rPr>
-      <w:shd w:val="clear"/>
+      <w:shd w:val="clear" w:color="auto" w:fill="auto"/>
     </w:rPr>
     <w:tblPr>
       <w:tblCellMar>
@@ -39685,7 +39545,7 @@
       <w:rPr/>
     </w:pPr>
     <w:rPr>
-      <w:shd w:val="clear"/>
+      <w:shd w:val="clear" w:color="auto" w:fill="auto"/>
     </w:rPr>
     <w:tblPr>
       <w:tblCellMar>
@@ -39752,7 +39612,7 @@
       <w:rPr/>
     </w:pPr>
     <w:rPr>
-      <w:shd w:val="clear"/>
+      <w:shd w:val="clear" w:color="auto" w:fill="auto"/>
     </w:rPr>
     <w:tblPr>
       <w:tblCellMar>
@@ -39819,7 +39679,7 @@
       <w:rPr/>
     </w:pPr>
     <w:rPr>
-      <w:shd w:val="clear"/>
+      <w:shd w:val="clear" w:color="auto" w:fill="auto"/>
     </w:rPr>
     <w:tblPr>
       <w:tblCellMar>
@@ -39886,7 +39746,7 @@
       <w:rPr/>
     </w:pPr>
     <w:rPr>
-      <w:shd w:val="clear"/>
+      <w:shd w:val="clear" w:color="auto" w:fill="auto"/>
     </w:rPr>
     <w:tblPr>
       <w:tblCellMar>
@@ -39953,7 +39813,7 @@
       <w:rPr/>
     </w:pPr>
     <w:rPr>
-      <w:shd w:val="clear"/>
+      <w:shd w:val="clear" w:color="auto" w:fill="auto"/>
     </w:rPr>
     <w:tblPr>
       <w:tblCellMar>
@@ -40020,7 +39880,7 @@
       <w:rPr/>
     </w:pPr>
     <w:rPr>
-      <w:shd w:val="clear"/>
+      <w:shd w:val="clear" w:color="auto" w:fill="auto"/>
     </w:rPr>
     <w:tblPr>
       <w:tblCellMar>
@@ -40087,7 +39947,7 @@
       <w:rPr/>
     </w:pPr>
     <w:rPr>
-      <w:shd w:val="clear"/>
+      <w:shd w:val="clear" w:color="auto" w:fill="auto"/>
     </w:rPr>
     <w:tblPr>
       <w:tblBorders>
@@ -40149,7 +40009,7 @@
       <w:rPr/>
     </w:pPr>
     <w:rPr>
-      <w:shd w:val="clear"/>
+      <w:shd w:val="clear" w:color="auto" w:fill="auto"/>
     </w:rPr>
     <w:tblPr>
       <w:tblBorders>
@@ -40211,7 +40071,7 @@
       <w:rPr/>
     </w:pPr>
     <w:rPr>
-      <w:shd w:val="clear"/>
+      <w:shd w:val="clear" w:color="auto" w:fill="auto"/>
     </w:rPr>
     <w:tblPr>
       <w:tblBorders>
@@ -40273,7 +40133,7 @@
       <w:rPr/>
     </w:pPr>
     <w:rPr>
-      <w:shd w:val="clear"/>
+      <w:shd w:val="clear" w:color="auto" w:fill="auto"/>
     </w:rPr>
     <w:tblPr>
       <w:tblBorders>
@@ -40335,7 +40195,7 @@
       <w:rPr/>
     </w:pPr>
     <w:rPr>
-      <w:shd w:val="clear"/>
+      <w:shd w:val="clear" w:color="auto" w:fill="auto"/>
     </w:rPr>
     <w:tblPr>
       <w:tblBorders>
@@ -40397,7 +40257,7 @@
       <w:rPr/>
     </w:pPr>
     <w:rPr>
-      <w:shd w:val="clear"/>
+      <w:shd w:val="clear" w:color="auto" w:fill="auto"/>
     </w:rPr>
     <w:tblPr>
       <w:tblBorders>
@@ -40459,7 +40319,7 @@
       <w:rPr/>
     </w:pPr>
     <w:rPr>
-      <w:shd w:val="clear"/>
+      <w:shd w:val="clear" w:color="auto" w:fill="auto"/>
     </w:rPr>
     <w:tblPr>
       <w:tblBorders>
@@ -40521,7 +40381,7 @@
       <w:rPr/>
     </w:pPr>
     <w:rPr>
-      <w:shd w:val="clear"/>
+      <w:shd w:val="clear" w:color="auto" w:fill="auto"/>
     </w:rPr>
     <w:tblPr>
       <w:tblBorders>
@@ -40645,7 +40505,7 @@
       <w:rPr/>
     </w:pPr>
     <w:rPr>
-      <w:shd w:val="clear"/>
+      <w:shd w:val="clear" w:color="auto" w:fill="auto"/>
     </w:rPr>
     <w:tblPr>
       <w:tblBorders>
@@ -40769,7 +40629,7 @@
       <w:rPr/>
     </w:pPr>
     <w:rPr>
-      <w:shd w:val="clear"/>
+      <w:shd w:val="clear" w:color="auto" w:fill="auto"/>
     </w:rPr>
     <w:tblPr>
       <w:tblBorders>
@@ -40893,7 +40753,7 @@
       <w:rPr/>
     </w:pPr>
     <w:rPr>
-      <w:shd w:val="clear"/>
+      <w:shd w:val="clear" w:color="auto" w:fill="auto"/>
     </w:rPr>
     <w:tblPr>
       <w:tblBorders>
@@ -41017,7 +40877,7 @@
       <w:rPr/>
     </w:pPr>
     <w:rPr>
-      <w:shd w:val="clear"/>
+      <w:shd w:val="clear" w:color="auto" w:fill="auto"/>
     </w:rPr>
     <w:tblPr>
       <w:tblBorders>
@@ -41141,7 +41001,7 @@
       <w:rPr/>
     </w:pPr>
     <w:rPr>
-      <w:shd w:val="clear"/>
+      <w:shd w:val="clear" w:color="auto" w:fill="auto"/>
     </w:rPr>
     <w:tblPr>
       <w:tblBorders>
@@ -41265,7 +41125,7 @@
       <w:rPr/>
     </w:pPr>
     <w:rPr>
-      <w:shd w:val="clear"/>
+      <w:shd w:val="clear" w:color="auto" w:fill="auto"/>
     </w:rPr>
     <w:tblPr>
       <w:tblBorders>
@@ -41389,7 +41249,7 @@
       <w:rPr/>
     </w:pPr>
     <w:rPr>
-      <w:shd w:val="clear"/>
+      <w:shd w:val="clear" w:color="auto" w:fill="auto"/>
     </w:rPr>
     <w:tblPr>
       <w:tblBorders>
@@ -41469,7 +41329,7 @@
       <w:rPr/>
     </w:pPr>
     <w:rPr>
-      <w:shd w:val="clear"/>
+      <w:shd w:val="clear" w:color="auto" w:fill="auto"/>
     </w:rPr>
     <w:tblPr>
       <w:tblBorders>
@@ -41549,7 +41409,7 @@
       <w:rPr/>
     </w:pPr>
     <w:rPr>
-      <w:shd w:val="clear"/>
+      <w:shd w:val="clear" w:color="auto" w:fill="auto"/>
     </w:rPr>
     <w:tblPr>
       <w:tblBorders>
@@ -41629,7 +41489,7 @@
       <w:rPr/>
     </w:pPr>
     <w:rPr>
-      <w:shd w:val="clear"/>
+      <w:shd w:val="clear" w:color="auto" w:fill="auto"/>
     </w:rPr>
     <w:tblPr>
       <w:tblBorders>
@@ -41709,7 +41569,7 @@
       <w:rPr/>
     </w:pPr>
     <w:rPr>
-      <w:shd w:val="clear"/>
+      <w:shd w:val="clear" w:color="auto" w:fill="auto"/>
     </w:rPr>
     <w:tblPr>
       <w:tblBorders>
@@ -41789,7 +41649,7 @@
       <w:rPr/>
     </w:pPr>
     <w:rPr>
-      <w:shd w:val="clear"/>
+      <w:shd w:val="clear" w:color="auto" w:fill="auto"/>
     </w:rPr>
     <w:tblPr>
       <w:tblBorders>
@@ -41869,7 +41729,7 @@
       <w:rPr/>
     </w:pPr>
     <w:rPr>
-      <w:shd w:val="clear"/>
+      <w:shd w:val="clear" w:color="auto" w:fill="auto"/>
     </w:rPr>
     <w:tblPr>
       <w:tblBorders>

</xml_diff>